<commit_message>
Anleitung: Bestellübersicht-Preischeck und aktuelle CSV-Spalten dokumentiert
Kapitel 5 (Bestellübersicht) ergänzt um:
- Hinweis auf die automatische Katalog-Aktualisierung beim Öffnen und die
  rote Hervorhebung geänderter/entfernter Artikel
- korrigierte Beschreibung der "Bestellliste als CSV herunterladen"-Spalten
  (vorher veraltet: artnr/menge/kommentar, jetzt inkl. Käuferdaten, Gebinde,
  Preis, Summe und Gesamtbetrag)

Gleiche Korrektur in Kapitel 7 (Schritt 5). Stand-Datum aktualisiert.
</commit_message>
<xml_diff>
--- a/FoodCoop-Alte-Eiche-Webshop-Anleitung.docx
+++ b/FoodCoop-Alte-Eiche-Webshop-Anleitung.docx
@@ -42,7 +42,7 @@
         <w:rPr>
           <w:color w:val="646464"/>
         </w:rPr>
-        <w:t>Stand: 7. August 2026</w:t>
+        <w:t>Stand: 19. August 2026</w:t>
       </w:r>
     </w:p>
     <w:p>
@@ -83,11 +83,7 @@
       </w:pPr>
       <w:r>
         <w:fldChar w:fldCharType="begin"/>
-      </w:r>
-      <w:r>
         <w:instrText xml:space="preserve"> TOC \o "1-3" </w:instrText>
-      </w:r>
-      <w:r>
         <w:fldChar w:fldCharType="separate"/>
       </w:r>
       <w:r>
@@ -95,46 +91,11 @@
           <w:noProof/>
         </w:rPr>
         <w:t>Inhaltsverzeichnis</w:t>
-      </w:r>
-      <w:r>
-        <w:rPr>
-          <w:noProof/>
-        </w:rPr>
         <w:tab/>
-      </w:r>
-      <w:r>
-        <w:rPr>
-          <w:noProof/>
-        </w:rPr>
         <w:fldChar w:fldCharType="begin"/>
-      </w:r>
-      <w:r>
-        <w:rPr>
-          <w:noProof/>
-        </w:rPr>
         <w:instrText xml:space="preserve"> PAGEREF _Toc237021259 \h </w:instrText>
-      </w:r>
-      <w:r>
-        <w:rPr>
-          <w:noProof/>
-        </w:rPr>
-      </w:r>
-      <w:r>
-        <w:rPr>
-          <w:noProof/>
-        </w:rPr>
         <w:fldChar w:fldCharType="separate"/>
-      </w:r>
-      <w:r>
-        <w:rPr>
-          <w:noProof/>
-        </w:rPr>
         <w:t>2</w:t>
-      </w:r>
-      <w:r>
-        <w:rPr>
-          <w:noProof/>
-        </w:rPr>
         <w:fldChar w:fldCharType="end"/>
       </w:r>
     </w:p>
@@ -155,46 +116,11 @@
           <w:noProof/>
         </w:rPr>
         <w:t>1. Ueberblick</w:t>
-      </w:r>
-      <w:r>
-        <w:rPr>
-          <w:noProof/>
-        </w:rPr>
         <w:tab/>
-      </w:r>
-      <w:r>
-        <w:rPr>
-          <w:noProof/>
-        </w:rPr>
         <w:fldChar w:fldCharType="begin"/>
-      </w:r>
-      <w:r>
-        <w:rPr>
-          <w:noProof/>
-        </w:rPr>
         <w:instrText xml:space="preserve"> PAGEREF _Toc237021260 \h </w:instrText>
-      </w:r>
-      <w:r>
-        <w:rPr>
-          <w:noProof/>
-        </w:rPr>
-      </w:r>
-      <w:r>
-        <w:rPr>
-          <w:noProof/>
-        </w:rPr>
         <w:fldChar w:fldCharType="separate"/>
-      </w:r>
-      <w:r>
-        <w:rPr>
-          <w:noProof/>
-        </w:rPr>
         <w:t>3</w:t>
-      </w:r>
-      <w:r>
-        <w:rPr>
-          <w:noProof/>
-        </w:rPr>
         <w:fldChar w:fldCharType="end"/>
       </w:r>
     </w:p>
@@ -215,46 +141,11 @@
           <w:noProof/>
         </w:rPr>
         <w:t>2. Anmeldung und Registrierung</w:t>
-      </w:r>
-      <w:r>
-        <w:rPr>
-          <w:noProof/>
-        </w:rPr>
         <w:tab/>
-      </w:r>
-      <w:r>
-        <w:rPr>
-          <w:noProof/>
-        </w:rPr>
         <w:fldChar w:fldCharType="begin"/>
-      </w:r>
-      <w:r>
-        <w:rPr>
-          <w:noProof/>
-        </w:rPr>
         <w:instrText xml:space="preserve"> PAGEREF _Toc237021261 \h </w:instrText>
-      </w:r>
-      <w:r>
-        <w:rPr>
-          <w:noProof/>
-        </w:rPr>
-      </w:r>
-      <w:r>
-        <w:rPr>
-          <w:noProof/>
-        </w:rPr>
         <w:fldChar w:fldCharType="separate"/>
-      </w:r>
-      <w:r>
-        <w:rPr>
-          <w:noProof/>
-        </w:rPr>
         <w:t>3</w:t>
-      </w:r>
-      <w:r>
-        <w:rPr>
-          <w:noProof/>
-        </w:rPr>
         <w:fldChar w:fldCharType="end"/>
       </w:r>
     </w:p>
@@ -273,46 +164,11 @@
           <w:noProof/>
         </w:rPr>
         <w:t>2.1 Anmelden</w:t>
-      </w:r>
-      <w:r>
-        <w:rPr>
-          <w:noProof/>
-        </w:rPr>
         <w:tab/>
-      </w:r>
-      <w:r>
-        <w:rPr>
-          <w:noProof/>
-        </w:rPr>
         <w:fldChar w:fldCharType="begin"/>
-      </w:r>
-      <w:r>
-        <w:rPr>
-          <w:noProof/>
-        </w:rPr>
         <w:instrText xml:space="preserve"> PAGEREF _Toc237021262 \h </w:instrText>
-      </w:r>
-      <w:r>
-        <w:rPr>
-          <w:noProof/>
-        </w:rPr>
-      </w:r>
-      <w:r>
-        <w:rPr>
-          <w:noProof/>
-        </w:rPr>
         <w:fldChar w:fldCharType="separate"/>
-      </w:r>
-      <w:r>
-        <w:rPr>
-          <w:noProof/>
-        </w:rPr>
         <w:t>3</w:t>
-      </w:r>
-      <w:r>
-        <w:rPr>
-          <w:noProof/>
-        </w:rPr>
         <w:fldChar w:fldCharType="end"/>
       </w:r>
     </w:p>
@@ -331,46 +187,11 @@
           <w:noProof/>
         </w:rPr>
         <w:t>2.2 Registrieren</w:t>
-      </w:r>
-      <w:r>
-        <w:rPr>
-          <w:noProof/>
-        </w:rPr>
         <w:tab/>
-      </w:r>
-      <w:r>
-        <w:rPr>
-          <w:noProof/>
-        </w:rPr>
         <w:fldChar w:fldCharType="begin"/>
-      </w:r>
-      <w:r>
-        <w:rPr>
-          <w:noProof/>
-        </w:rPr>
         <w:instrText xml:space="preserve"> PAGEREF _Toc237021263 \h </w:instrText>
-      </w:r>
-      <w:r>
-        <w:rPr>
-          <w:noProof/>
-        </w:rPr>
-      </w:r>
-      <w:r>
-        <w:rPr>
-          <w:noProof/>
-        </w:rPr>
         <w:fldChar w:fldCharType="separate"/>
-      </w:r>
-      <w:r>
-        <w:rPr>
-          <w:noProof/>
-        </w:rPr>
         <w:t>4</w:t>
-      </w:r>
-      <w:r>
-        <w:rPr>
-          <w:noProof/>
-        </w:rPr>
         <w:fldChar w:fldCharType="end"/>
       </w:r>
     </w:p>
@@ -389,46 +210,11 @@
           <w:noProof/>
         </w:rPr>
         <w:t>2.3 Passwort vergessen</w:t>
-      </w:r>
-      <w:r>
-        <w:rPr>
-          <w:noProof/>
-        </w:rPr>
         <w:tab/>
-      </w:r>
-      <w:r>
-        <w:rPr>
-          <w:noProof/>
-        </w:rPr>
         <w:fldChar w:fldCharType="begin"/>
-      </w:r>
-      <w:r>
-        <w:rPr>
-          <w:noProof/>
-        </w:rPr>
         <w:instrText xml:space="preserve"> PAGEREF _Toc237021264 \h </w:instrText>
-      </w:r>
-      <w:r>
-        <w:rPr>
-          <w:noProof/>
-        </w:rPr>
-      </w:r>
-      <w:r>
-        <w:rPr>
-          <w:noProof/>
-        </w:rPr>
         <w:fldChar w:fldCharType="separate"/>
-      </w:r>
-      <w:r>
-        <w:rPr>
-          <w:noProof/>
-        </w:rPr>
         <w:t>4</w:t>
-      </w:r>
-      <w:r>
-        <w:rPr>
-          <w:noProof/>
-        </w:rPr>
         <w:fldChar w:fldCharType="end"/>
       </w:r>
     </w:p>
@@ -449,46 +235,11 @@
           <w:noProof/>
         </w:rPr>
         <w:t>3. Shop-Hauptseite</w:t>
-      </w:r>
-      <w:r>
-        <w:rPr>
-          <w:noProof/>
-        </w:rPr>
         <w:tab/>
-      </w:r>
-      <w:r>
-        <w:rPr>
-          <w:noProof/>
-        </w:rPr>
         <w:fldChar w:fldCharType="begin"/>
-      </w:r>
-      <w:r>
-        <w:rPr>
-          <w:noProof/>
-        </w:rPr>
         <w:instrText xml:space="preserve"> PAGEREF _Toc237021265 \h </w:instrText>
-      </w:r>
-      <w:r>
-        <w:rPr>
-          <w:noProof/>
-        </w:rPr>
-      </w:r>
-      <w:r>
-        <w:rPr>
-          <w:noProof/>
-        </w:rPr>
         <w:fldChar w:fldCharType="separate"/>
-      </w:r>
-      <w:r>
-        <w:rPr>
-          <w:noProof/>
-        </w:rPr>
         <w:t>5</w:t>
-      </w:r>
-      <w:r>
-        <w:rPr>
-          <w:noProof/>
-        </w:rPr>
         <w:fldChar w:fldCharType="end"/>
       </w:r>
     </w:p>
@@ -509,46 +260,11 @@
           <w:noProof/>
         </w:rPr>
         <w:t>4. Warenkorb</w:t>
-      </w:r>
-      <w:r>
-        <w:rPr>
-          <w:noProof/>
-        </w:rPr>
         <w:tab/>
-      </w:r>
-      <w:r>
-        <w:rPr>
-          <w:noProof/>
-        </w:rPr>
         <w:fldChar w:fldCharType="begin"/>
-      </w:r>
-      <w:r>
-        <w:rPr>
-          <w:noProof/>
-        </w:rPr>
         <w:instrText xml:space="preserve"> PAGEREF _Toc237021266 \h </w:instrText>
-      </w:r>
-      <w:r>
-        <w:rPr>
-          <w:noProof/>
-        </w:rPr>
-      </w:r>
-      <w:r>
-        <w:rPr>
-          <w:noProof/>
-        </w:rPr>
         <w:fldChar w:fldCharType="separate"/>
-      </w:r>
-      <w:r>
-        <w:rPr>
-          <w:noProof/>
-        </w:rPr>
         <w:t>7</w:t>
-      </w:r>
-      <w:r>
-        <w:rPr>
-          <w:noProof/>
-        </w:rPr>
         <w:fldChar w:fldCharType="end"/>
       </w:r>
     </w:p>
@@ -569,46 +285,11 @@
           <w:noProof/>
         </w:rPr>
         <w:t>5. Bestelluebersicht</w:t>
-      </w:r>
-      <w:r>
-        <w:rPr>
-          <w:noProof/>
-        </w:rPr>
         <w:tab/>
-      </w:r>
-      <w:r>
-        <w:rPr>
-          <w:noProof/>
-        </w:rPr>
         <w:fldChar w:fldCharType="begin"/>
-      </w:r>
-      <w:r>
-        <w:rPr>
-          <w:noProof/>
-        </w:rPr>
         <w:instrText xml:space="preserve"> PAGEREF _Toc237021267 \h </w:instrText>
-      </w:r>
-      <w:r>
-        <w:rPr>
-          <w:noProof/>
-        </w:rPr>
-      </w:r>
-      <w:r>
-        <w:rPr>
-          <w:noProof/>
-        </w:rPr>
         <w:fldChar w:fldCharType="separate"/>
-      </w:r>
-      <w:r>
-        <w:rPr>
-          <w:noProof/>
-        </w:rPr>
         <w:t>7</w:t>
-      </w:r>
-      <w:r>
-        <w:rPr>
-          <w:noProof/>
-        </w:rPr>
         <w:fldChar w:fldCharType="end"/>
       </w:r>
     </w:p>
@@ -629,46 +310,11 @@
           <w:noProof/>
         </w:rPr>
         <w:t>6. Verwaltungsbereich (Admin)</w:t>
-      </w:r>
-      <w:r>
-        <w:rPr>
-          <w:noProof/>
-        </w:rPr>
         <w:tab/>
-      </w:r>
-      <w:r>
-        <w:rPr>
-          <w:noProof/>
-        </w:rPr>
         <w:fldChar w:fldCharType="begin"/>
-      </w:r>
-      <w:r>
-        <w:rPr>
-          <w:noProof/>
-        </w:rPr>
         <w:instrText xml:space="preserve"> PAGEREF _Toc237021268 \h </w:instrText>
-      </w:r>
-      <w:r>
-        <w:rPr>
-          <w:noProof/>
-        </w:rPr>
-      </w:r>
-      <w:r>
-        <w:rPr>
-          <w:noProof/>
-        </w:rPr>
         <w:fldChar w:fldCharType="separate"/>
-      </w:r>
-      <w:r>
-        <w:rPr>
-          <w:noProof/>
-        </w:rPr>
         <w:t>8</w:t>
-      </w:r>
-      <w:r>
-        <w:rPr>
-          <w:noProof/>
-        </w:rPr>
         <w:fldChar w:fldCharType="end"/>
       </w:r>
     </w:p>
@@ -687,46 +333,11 @@
           <w:noProof/>
         </w:rPr>
         <w:t>6.1 Admin-Passwort einrichten</w:t>
-      </w:r>
-      <w:r>
-        <w:rPr>
-          <w:noProof/>
-        </w:rPr>
         <w:tab/>
-      </w:r>
-      <w:r>
-        <w:rPr>
-          <w:noProof/>
-        </w:rPr>
         <w:fldChar w:fldCharType="begin"/>
-      </w:r>
-      <w:r>
-        <w:rPr>
-          <w:noProof/>
-        </w:rPr>
         <w:instrText xml:space="preserve"> PAGEREF _Toc237021269 \h </w:instrText>
-      </w:r>
-      <w:r>
-        <w:rPr>
-          <w:noProof/>
-        </w:rPr>
-      </w:r>
-      <w:r>
-        <w:rPr>
-          <w:noProof/>
-        </w:rPr>
         <w:fldChar w:fldCharType="separate"/>
-      </w:r>
-      <w:r>
-        <w:rPr>
-          <w:noProof/>
-        </w:rPr>
         <w:t>9</w:t>
-      </w:r>
-      <w:r>
-        <w:rPr>
-          <w:noProof/>
-        </w:rPr>
         <w:fldChar w:fldCharType="end"/>
       </w:r>
     </w:p>
@@ -745,46 +356,11 @@
           <w:noProof/>
         </w:rPr>
         <w:t>6.2 Verwaltungsbereich gesperrt</w:t>
-      </w:r>
-      <w:r>
-        <w:rPr>
-          <w:noProof/>
-        </w:rPr>
         <w:tab/>
-      </w:r>
-      <w:r>
-        <w:rPr>
-          <w:noProof/>
-        </w:rPr>
         <w:fldChar w:fldCharType="begin"/>
-      </w:r>
-      <w:r>
-        <w:rPr>
-          <w:noProof/>
-        </w:rPr>
         <w:instrText xml:space="preserve"> PAGEREF _Toc237021270 \h </w:instrText>
-      </w:r>
-      <w:r>
-        <w:rPr>
-          <w:noProof/>
-        </w:rPr>
-      </w:r>
-      <w:r>
-        <w:rPr>
-          <w:noProof/>
-        </w:rPr>
         <w:fldChar w:fldCharType="separate"/>
-      </w:r>
-      <w:r>
-        <w:rPr>
-          <w:noProof/>
-        </w:rPr>
         <w:t>9</w:t>
-      </w:r>
-      <w:r>
-        <w:rPr>
-          <w:noProof/>
-        </w:rPr>
         <w:fldChar w:fldCharType="end"/>
       </w:r>
     </w:p>
@@ -803,46 +379,11 @@
           <w:noProof/>
         </w:rPr>
         <w:t>6.3 Status</w:t>
-      </w:r>
-      <w:r>
-        <w:rPr>
-          <w:noProof/>
-        </w:rPr>
         <w:tab/>
-      </w:r>
-      <w:r>
-        <w:rPr>
-          <w:noProof/>
-        </w:rPr>
         <w:fldChar w:fldCharType="begin"/>
-      </w:r>
-      <w:r>
-        <w:rPr>
-          <w:noProof/>
-        </w:rPr>
         <w:instrText xml:space="preserve"> PAGEREF _Toc237021271 \h </w:instrText>
-      </w:r>
-      <w:r>
-        <w:rPr>
-          <w:noProof/>
-        </w:rPr>
-      </w:r>
-      <w:r>
-        <w:rPr>
-          <w:noProof/>
-        </w:rPr>
         <w:fldChar w:fldCharType="separate"/>
-      </w:r>
-      <w:r>
-        <w:rPr>
-          <w:noProof/>
-        </w:rPr>
         <w:t>11</w:t>
-      </w:r>
-      <w:r>
-        <w:rPr>
-          <w:noProof/>
-        </w:rPr>
         <w:fldChar w:fldCharType="end"/>
       </w:r>
     </w:p>
@@ -861,46 +402,11 @@
           <w:noProof/>
         </w:rPr>
         <w:t>6.4 Produktkatalog je Kategorie</w:t>
-      </w:r>
-      <w:r>
-        <w:rPr>
-          <w:noProof/>
-        </w:rPr>
         <w:tab/>
-      </w:r>
-      <w:r>
-        <w:rPr>
-          <w:noProof/>
-        </w:rPr>
         <w:fldChar w:fldCharType="begin"/>
-      </w:r>
-      <w:r>
-        <w:rPr>
-          <w:noProof/>
-        </w:rPr>
         <w:instrText xml:space="preserve"> PAGEREF _Toc237021272 \h </w:instrText>
-      </w:r>
-      <w:r>
-        <w:rPr>
-          <w:noProof/>
-        </w:rPr>
-      </w:r>
-      <w:r>
-        <w:rPr>
-          <w:noProof/>
-        </w:rPr>
         <w:fldChar w:fldCharType="separate"/>
-      </w:r>
-      <w:r>
-        <w:rPr>
-          <w:noProof/>
-        </w:rPr>
         <w:t>11</w:t>
-      </w:r>
-      <w:r>
-        <w:rPr>
-          <w:noProof/>
-        </w:rPr>
         <w:fldChar w:fldCharType="end"/>
       </w:r>
     </w:p>
@@ -919,46 +425,11 @@
           <w:noProof/>
         </w:rPr>
         <w:t>6.5 Prozentzuschlaege</w:t>
-      </w:r>
-      <w:r>
-        <w:rPr>
-          <w:noProof/>
-        </w:rPr>
         <w:tab/>
-      </w:r>
-      <w:r>
-        <w:rPr>
-          <w:noProof/>
-        </w:rPr>
         <w:fldChar w:fldCharType="begin"/>
-      </w:r>
-      <w:r>
-        <w:rPr>
-          <w:noProof/>
-        </w:rPr>
         <w:instrText xml:space="preserve"> PAGEREF _Toc237021273 \h </w:instrText>
-      </w:r>
-      <w:r>
-        <w:rPr>
-          <w:noProof/>
-        </w:rPr>
-      </w:r>
-      <w:r>
-        <w:rPr>
-          <w:noProof/>
-        </w:rPr>
         <w:fldChar w:fldCharType="separate"/>
-      </w:r>
-      <w:r>
-        <w:rPr>
-          <w:noProof/>
-        </w:rPr>
         <w:t>12</w:t>
-      </w:r>
-      <w:r>
-        <w:rPr>
-          <w:noProof/>
-        </w:rPr>
         <w:fldChar w:fldCharType="end"/>
       </w:r>
     </w:p>
@@ -977,46 +448,11 @@
           <w:noProof/>
         </w:rPr>
         <w:t>6.6 Kundenkonten</w:t>
-      </w:r>
-      <w:r>
-        <w:rPr>
-          <w:noProof/>
-        </w:rPr>
         <w:tab/>
-      </w:r>
-      <w:r>
-        <w:rPr>
-          <w:noProof/>
-        </w:rPr>
         <w:fldChar w:fldCharType="begin"/>
-      </w:r>
-      <w:r>
-        <w:rPr>
-          <w:noProof/>
-        </w:rPr>
         <w:instrText xml:space="preserve"> PAGEREF _Toc237021274 \h </w:instrText>
-      </w:r>
-      <w:r>
-        <w:rPr>
-          <w:noProof/>
-        </w:rPr>
-      </w:r>
-      <w:r>
-        <w:rPr>
-          <w:noProof/>
-        </w:rPr>
         <w:fldChar w:fldCharType="separate"/>
-      </w:r>
-      <w:r>
-        <w:rPr>
-          <w:noProof/>
-        </w:rPr>
         <w:t>13</w:t>
-      </w:r>
-      <w:r>
-        <w:rPr>
-          <w:noProof/>
-        </w:rPr>
         <w:fldChar w:fldCharType="end"/>
       </w:r>
     </w:p>
@@ -1035,46 +471,11 @@
           <w:noProof/>
         </w:rPr>
         <w:t>6.7 Admin-Passwort aendern</w:t>
-      </w:r>
-      <w:r>
-        <w:rPr>
-          <w:noProof/>
-        </w:rPr>
         <w:tab/>
-      </w:r>
-      <w:r>
-        <w:rPr>
-          <w:noProof/>
-        </w:rPr>
         <w:fldChar w:fldCharType="begin"/>
-      </w:r>
-      <w:r>
-        <w:rPr>
-          <w:noProof/>
-        </w:rPr>
         <w:instrText xml:space="preserve"> PAGEREF _Toc237021275 \h </w:instrText>
-      </w:r>
-      <w:r>
-        <w:rPr>
-          <w:noProof/>
-        </w:rPr>
-      </w:r>
-      <w:r>
-        <w:rPr>
-          <w:noProof/>
-        </w:rPr>
         <w:fldChar w:fldCharType="separate"/>
-      </w:r>
-      <w:r>
-        <w:rPr>
-          <w:noProof/>
-        </w:rPr>
         <w:t>14</w:t>
-      </w:r>
-      <w:r>
-        <w:rPr>
-          <w:noProof/>
-        </w:rPr>
         <w:fldChar w:fldCharType="end"/>
       </w:r>
     </w:p>
@@ -1095,46 +496,11 @@
           <w:noProof/>
         </w:rPr>
         <w:t>7. Ablauf einer Bestellung - Schritt fuer Schritt</w:t>
-      </w:r>
-      <w:r>
-        <w:rPr>
-          <w:noProof/>
-        </w:rPr>
         <w:tab/>
-      </w:r>
-      <w:r>
-        <w:rPr>
-          <w:noProof/>
-        </w:rPr>
         <w:fldChar w:fldCharType="begin"/>
-      </w:r>
-      <w:r>
-        <w:rPr>
-          <w:noProof/>
-        </w:rPr>
         <w:instrText xml:space="preserve"> PAGEREF _Toc237021276 \h </w:instrText>
-      </w:r>
-      <w:r>
-        <w:rPr>
-          <w:noProof/>
-        </w:rPr>
-      </w:r>
-      <w:r>
-        <w:rPr>
-          <w:noProof/>
-        </w:rPr>
         <w:fldChar w:fldCharType="separate"/>
-      </w:r>
-      <w:r>
-        <w:rPr>
-          <w:noProof/>
-        </w:rPr>
         <w:t>15</w:t>
-      </w:r>
-      <w:r>
-        <w:rPr>
-          <w:noProof/>
-        </w:rPr>
         <w:fldChar w:fldCharType="end"/>
       </w:r>
     </w:p>
@@ -1153,46 +519,11 @@
           <w:noProof/>
         </w:rPr>
         <w:t>Schritt 1: Artikel suchen</w:t>
-      </w:r>
-      <w:r>
-        <w:rPr>
-          <w:noProof/>
-        </w:rPr>
         <w:tab/>
-      </w:r>
-      <w:r>
-        <w:rPr>
-          <w:noProof/>
-        </w:rPr>
         <w:fldChar w:fldCharType="begin"/>
-      </w:r>
-      <w:r>
-        <w:rPr>
-          <w:noProof/>
-        </w:rPr>
         <w:instrText xml:space="preserve"> PAGEREF _Toc237021277 \h </w:instrText>
-      </w:r>
-      <w:r>
-        <w:rPr>
-          <w:noProof/>
-        </w:rPr>
-      </w:r>
-      <w:r>
-        <w:rPr>
-          <w:noProof/>
-        </w:rPr>
         <w:fldChar w:fldCharType="separate"/>
-      </w:r>
-      <w:r>
-        <w:rPr>
-          <w:noProof/>
-        </w:rPr>
         <w:t>15</w:t>
-      </w:r>
-      <w:r>
-        <w:rPr>
-          <w:noProof/>
-        </w:rPr>
         <w:fldChar w:fldCharType="end"/>
       </w:r>
     </w:p>
@@ -1211,46 +542,11 @@
           <w:noProof/>
         </w:rPr>
         <w:t>Schritt 2: Menge festlegen und in den Warenkorb legen</w:t>
-      </w:r>
-      <w:r>
-        <w:rPr>
-          <w:noProof/>
-        </w:rPr>
         <w:tab/>
-      </w:r>
-      <w:r>
-        <w:rPr>
-          <w:noProof/>
-        </w:rPr>
         <w:fldChar w:fldCharType="begin"/>
-      </w:r>
-      <w:r>
-        <w:rPr>
-          <w:noProof/>
-        </w:rPr>
         <w:instrText xml:space="preserve"> PAGEREF _Toc237021278 \h </w:instrText>
-      </w:r>
-      <w:r>
-        <w:rPr>
-          <w:noProof/>
-        </w:rPr>
-      </w:r>
-      <w:r>
-        <w:rPr>
-          <w:noProof/>
-        </w:rPr>
         <w:fldChar w:fldCharType="separate"/>
-      </w:r>
-      <w:r>
-        <w:rPr>
-          <w:noProof/>
-        </w:rPr>
         <w:t>15</w:t>
-      </w:r>
-      <w:r>
-        <w:rPr>
-          <w:noProof/>
-        </w:rPr>
         <w:fldChar w:fldCharType="end"/>
       </w:r>
     </w:p>
@@ -1269,46 +565,11 @@
           <w:noProof/>
         </w:rPr>
         <w:t>Schritt 3: Warenkorb pruefen</w:t>
-      </w:r>
-      <w:r>
-        <w:rPr>
-          <w:noProof/>
-        </w:rPr>
         <w:tab/>
-      </w:r>
-      <w:r>
-        <w:rPr>
-          <w:noProof/>
-        </w:rPr>
         <w:fldChar w:fldCharType="begin"/>
-      </w:r>
-      <w:r>
-        <w:rPr>
-          <w:noProof/>
-        </w:rPr>
         <w:instrText xml:space="preserve"> PAGEREF _Toc237021279 \h </w:instrText>
-      </w:r>
-      <w:r>
-        <w:rPr>
-          <w:noProof/>
-        </w:rPr>
-      </w:r>
-      <w:r>
-        <w:rPr>
-          <w:noProof/>
-        </w:rPr>
         <w:fldChar w:fldCharType="separate"/>
-      </w:r>
-      <w:r>
-        <w:rPr>
-          <w:noProof/>
-        </w:rPr>
         <w:t>16</w:t>
-      </w:r>
-      <w:r>
-        <w:rPr>
-          <w:noProof/>
-        </w:rPr>
         <w:fldChar w:fldCharType="end"/>
       </w:r>
     </w:p>
@@ -1327,46 +588,11 @@
           <w:noProof/>
         </w:rPr>
         <w:t>Schritt 4: Zur Bestelluebersicht wechseln und Daten eingeben</w:t>
-      </w:r>
-      <w:r>
-        <w:rPr>
-          <w:noProof/>
-        </w:rPr>
         <w:tab/>
-      </w:r>
-      <w:r>
-        <w:rPr>
-          <w:noProof/>
-        </w:rPr>
         <w:fldChar w:fldCharType="begin"/>
-      </w:r>
-      <w:r>
-        <w:rPr>
-          <w:noProof/>
-        </w:rPr>
         <w:instrText xml:space="preserve"> PAGEREF _Toc237021280 \h </w:instrText>
-      </w:r>
-      <w:r>
-        <w:rPr>
-          <w:noProof/>
-        </w:rPr>
-      </w:r>
-      <w:r>
-        <w:rPr>
-          <w:noProof/>
-        </w:rPr>
         <w:fldChar w:fldCharType="separate"/>
-      </w:r>
-      <w:r>
-        <w:rPr>
-          <w:noProof/>
-        </w:rPr>
         <w:t>16</w:t>
-      </w:r>
-      <w:r>
-        <w:rPr>
-          <w:noProof/>
-        </w:rPr>
         <w:fldChar w:fldCharType="end"/>
       </w:r>
     </w:p>
@@ -1385,46 +611,11 @@
           <w:noProof/>
         </w:rPr>
         <w:t>Schritt 5: Bestellung abschliessen</w:t>
-      </w:r>
-      <w:r>
-        <w:rPr>
-          <w:noProof/>
-        </w:rPr>
         <w:tab/>
-      </w:r>
-      <w:r>
-        <w:rPr>
-          <w:noProof/>
-        </w:rPr>
         <w:fldChar w:fldCharType="begin"/>
-      </w:r>
-      <w:r>
-        <w:rPr>
-          <w:noProof/>
-        </w:rPr>
         <w:instrText xml:space="preserve"> PAGEREF _Toc237021281 \h </w:instrText>
-      </w:r>
-      <w:r>
-        <w:rPr>
-          <w:noProof/>
-        </w:rPr>
-      </w:r>
-      <w:r>
-        <w:rPr>
-          <w:noProof/>
-        </w:rPr>
         <w:fldChar w:fldCharType="separate"/>
-      </w:r>
-      <w:r>
-        <w:rPr>
-          <w:noProof/>
-        </w:rPr>
         <w:t>17</w:t>
-      </w:r>
-      <w:r>
-        <w:rPr>
-          <w:noProof/>
-        </w:rPr>
         <w:fldChar w:fldCharType="end"/>
       </w:r>
     </w:p>
@@ -4163,7 +3354,7 @@
               <w:rPr>
                 <w:sz w:val="20"/>
               </w:rPr>
-              <w:t>Bestelltabelle mit Artikelnummer, Bezeichnung, Gebinde, Preis, MwSt.-Satz, Menge und Summe je Position.</w:t>
+              <w:t>Bestelltabelle mit Artikelnummer, Bezeichnung, Gebinde, Preis, MwSt.-Satz, Menge und Summe je Position. Haben sich Preise seit der letzten Auswahl geaendert oder ist ein Artikel nicht mehr verfuegbar, wird das rot markiert (alter Preis durchgestrichen bzw. ganze Zeile durchgestrichen mit dem Hinweis "nicht mehr verfuegbar").</w:t>
             </w:r>
           </w:p>
         </w:tc>
@@ -4283,7 +3474,7 @@
               <w:rPr>
                 <w:sz w:val="20"/>
               </w:rPr>
-              <w:t>Button "Bestellliste als CSV herunterladen" - laedt eine Datei mit den Spalten artnr, menge und kommentar (enthaelt die Produktbezeichnung) herunter.</w:t>
+              <w:t>Button "Bestellliste als CSV herunterladen" - laedt eine Datei mit Name, Adresse und Bankverbindung sowie Artikelnummer, Bezeichnung, Gebinde, Menge, Preis und Summe je Position plus Gesamt-Bestellbetrag herunter (entspricht den Angaben der E-Mail).</w:t>
             </w:r>
           </w:p>
         </w:tc>
@@ -4333,6 +3524,11 @@
     <w:p>
       <w:r>
         <w:t>Name, Adresse und Bankverbindung werden lokal gespeichert und beim naechsten Besuch automatisch wieder vorausgefuellt.</w:t>
+      </w:r>
+    </w:p>
+    <w:p>
+      <w:r>
+        <w:t>Beim Aufruf der Bestelluebersicht wird der Produktkatalog automatisch neu vom Server geladen und mit dem zuvor angezeigten Stand verglichen. So faellt sofort auf, wenn sich waehrend eines laenger offenen Warenkorbs Preise geaendert haben oder ein Artikel nicht mehr im Sortiment ist.</w:t>
       </w:r>
     </w:p>
     <w:p>
@@ -6970,7 +6166,7 @@
         <w:pStyle w:val="KeinLeerraum"/>
       </w:pPr>
       <w:r>
-        <w:t>Bestellliste als CSV herunterladen - speichert die Bestellung als Datei mit Artikelnummer, Menge und Bezeichnung im Kommentarfeld.</w:t>
+        <w:t>Bestellliste als CSV herunterladen - speichert die Bestellung inkl. Name, Adresse, Bankverbindung, Gebinde, Preis, Summe und Gesamtbetrag als Datei (entspricht den Angaben der E-Mail).</w:t>
       </w:r>
     </w:p>
     <w:p>

</xml_diff>

<commit_message>
Anleitung: Änderungsfälle in der Bestellübersicht ausführlich beschrieben
Kapitel 5 ergänzt um eine Tabelle mit den zwei Fällen (Preisänderung vs.
nicht mehr verfügbarer Artikel) und wie sie jeweils dargestellt werden,
sowie einen Screenshot-Ausschnitt als Beispiel (Hinweis-Banner, alter/neuer
Preis, durchgestrichene Zeile für entfernten Artikel).
</commit_message>
<xml_diff>
--- a/FoodCoop-Alte-Eiche-Webshop-Anleitung.docx
+++ b/FoodCoop-Alte-Eiche-Webshop-Anleitung.docx
@@ -3528,7 +3528,218 @@
     </w:p>
     <w:p>
       <w:r>
-        <w:t>Beim Aufruf der Bestelluebersicht wird der Produktkatalog automatisch neu vom Server geladen und mit dem zuvor angezeigten Stand verglichen. So faellt sofort auf, wenn sich waehrend eines laenger offenen Warenkorbs Preise geaendert haben oder ein Artikel nicht mehr im Sortiment ist.</w:t>
+        <w:t>Beim Aufruf der Bestelluebersicht wird der Produktkatalog automatisch neu vom Server geladen und mit dem zuvor angezeigten Stand verglichen. Das ist wichtig, wenn ein Warenkorb laenger im Browser liegen bleibt (z. B. ueber mehrere Besuche hinweg) und sich in der Zwischenzeit Preise oder das Sortiment geaendert haben. Dabei werden zwei Faelle unterschieden:</w:t>
+      </w:r>
+    </w:p>
+    <w:tbl>
+      <w:tblPr>
+        <w:tblW w:w="9080" w:type="dxa"/>
+        <w:tblBorders>
+          <w:top w:val="single" w:sz="4" w:space="0" w:color="auto"/>
+          <w:left w:val="single" w:sz="4" w:space="0" w:color="auto"/>
+          <w:bottom w:val="single" w:sz="4" w:space="0" w:color="auto"/>
+          <w:right w:val="single" w:sz="4" w:space="0" w:color="auto"/>
+          <w:insideH w:val="single" w:sz="4" w:space="0" w:color="auto"/>
+          <w:insideV w:val="single" w:sz="4" w:space="0" w:color="auto"/>
+        </w:tblBorders>
+        <w:tblLayout w:type="fixed"/>
+        <w:tblCellMar>
+          <w:left w:w="70" w:type="dxa"/>
+          <w:right w:w="70" w:type="dxa"/>
+        </w:tblCellMar>
+        <w:tblLook w:val="0000" w:firstRow="0" w:lastRow="0" w:firstColumn="0" w:lastColumn="0" w:noHBand="0" w:noVBand="0"/>
+      </w:tblPr>
+      <w:tblGrid>
+        <w:gridCol w:w="3200"/>
+        <w:gridCol w:w="5880"/>
+      </w:tblGrid>
+      <w:tr>
+        <w:tc>
+          <w:tcPr>
+            <w:tcW w:w="3200" w:type="dxa"/>
+            <w:shd w:val="clear" w:color="auto" w:fill="2C5B39"/>
+          </w:tcPr>
+          <w:p>
+            <w:pPr>
+              <w:rPr>
+                <w:b/>
+                <w:color w:val="FFFFFF"/>
+                <w:sz w:val="20"/>
+              </w:rPr>
+            </w:pPr>
+            <w:r>
+              <w:rPr>
+                <w:b/>
+                <w:color w:val="FFFFFF"/>
+                <w:sz w:val="20"/>
+              </w:rPr>
+              <w:t>Fall</w:t>
+            </w:r>
+          </w:p>
+        </w:tc>
+        <w:tc>
+          <w:tcPr>
+            <w:tcW w:w="5880" w:type="dxa"/>
+            <w:shd w:val="clear" w:color="auto" w:fill="2C5B39"/>
+          </w:tcPr>
+          <w:p>
+            <w:pPr>
+              <w:rPr>
+                <w:b/>
+                <w:color w:val="FFFFFF"/>
+                <w:sz w:val="20"/>
+              </w:rPr>
+            </w:pPr>
+            <w:r>
+              <w:rPr>
+                <w:b/>
+                <w:color w:val="FFFFFF"/>
+                <w:sz w:val="20"/>
+              </w:rPr>
+              <w:t>Darstellung</w:t>
+            </w:r>
+          </w:p>
+        </w:tc>
+      </w:tr>
+      <w:tr>
+        <w:tc>
+          <w:tcPr>
+            <w:tcW w:w="3200" w:type="dxa"/>
+          </w:tcPr>
+          <w:p>
+            <w:pPr>
+              <w:rPr>
+                <w:sz w:val="20"/>
+              </w:rPr>
+            </w:pPr>
+            <w:r>
+              <w:rPr>
+                <w:sz w:val="20"/>
+              </w:rPr>
+              <w:t>Preis eines Artikels hat sich geaendert</w:t>
+            </w:r>
+          </w:p>
+        </w:tc>
+        <w:tc>
+          <w:tcPr>
+            <w:tcW w:w="5880" w:type="dxa"/>
+          </w:tcPr>
+          <w:p>
+            <w:pPr>
+              <w:rPr>
+                <w:sz w:val="20"/>
+              </w:rPr>
+            </w:pPr>
+            <w:r>
+              <w:rPr>
+                <w:sz w:val="20"/>
+              </w:rPr>
+              <w:t>Der bisherige Preis erscheint durchgestrichen, direkt daneben in Rot der neue, aktuelle Preis.</w:t>
+            </w:r>
+          </w:p>
+        </w:tc>
+      </w:tr>
+      <w:tr>
+        <w:tc>
+          <w:tcPr>
+            <w:tcW w:w="3200" w:type="dxa"/>
+          </w:tcPr>
+          <w:p>
+            <w:pPr>
+              <w:rPr>
+                <w:sz w:val="20"/>
+              </w:rPr>
+            </w:pPr>
+            <w:r>
+              <w:rPr>
+                <w:sz w:val="20"/>
+              </w:rPr>
+              <w:t>Artikel ist nicht mehr im Katalog vorhanden (z. B. aus dem Sortiment genommen)</w:t>
+            </w:r>
+          </w:p>
+        </w:tc>
+        <w:tc>
+          <w:tcPr>
+            <w:tcW w:w="5880" w:type="dxa"/>
+          </w:tcPr>
+          <w:p>
+            <w:pPr>
+              <w:rPr>
+                <w:sz w:val="20"/>
+              </w:rPr>
+            </w:pPr>
+            <w:r>
+              <w:rPr>
+                <w:sz w:val="20"/>
+              </w:rPr>
+              <w:t>Die komplette Zeile wird durchgestrichen und rot dargestellt, statt einer Summe erscheint der Hinweis "nicht mehr verfuegbar".</w:t>
+            </w:r>
+          </w:p>
+        </w:tc>
+      </w:tr>
+    </w:tbl>
+    <w:p>
+      <w:r>
+        <w:t>In beiden Faellen erscheint zusaetzlich oben in der Bestelluebersicht ein rot umrandeter Hinweis-Banner, der auf die Anzahl betroffener Positionen aufmerksam macht. Das folgende Beispiel zeigt beide Faelle gleichzeitig: eine Preisaenderung (zweite Zeile) sowie einen entfernten Artikel (letzte Zeile).</w:t>
+      </w:r>
+    </w:p>
+    <w:p>
+      <w:pPr>
+        <w:jc w:val="center"/>
+      </w:pPr>
+      <w:r>
+        <w:rPr>
+          <w:noProof/>
+        </w:rPr>
+        <w:drawing>
+          <wp:inline distT="0" distB="0" distL="0" distR="0">
+            <wp:extent cx="5334000" cy="3654222"/>
+            <wp:effectExtent l="0" t="0" r="0" b="0"/>
+            <wp:docPr id="23" name="Grafik 23"/>
+            <wp:cNvGraphicFramePr/>
+            <a:graphic xmlns:a="http://schemas.openxmlformats.org/drawingml/2006/main">
+              <a:graphicData uri="http://schemas.openxmlformats.org/drawingml/2006/picture">
+                <pic:pic xmlns:pic="http://schemas.openxmlformats.org/drawingml/2006/picture">
+                  <pic:nvPicPr>
+                    <pic:cNvPr id="23" name=""/>
+                    <pic:cNvPicPr/>
+                  </pic:nvPicPr>
+                  <pic:blipFill>
+                    <a:blip r:embed="rId23"/>
+                    <a:stretch>
+                      <a:fillRect/>
+                    </a:stretch>
+                  </pic:blipFill>
+                  <pic:spPr>
+                    <a:xfrm>
+                      <a:off x="0" y="0"/>
+                      <a:ext cx="5334000" cy="3654222"/>
+                    </a:xfrm>
+                    <a:prstGeom prst="rect">
+                      <a:avLst/>
+                    </a:prstGeom>
+                  </pic:spPr>
+                </pic:pic>
+              </a:graphicData>
+            </a:graphic>
+          </wp:inline>
+        </w:drawing>
+      </w:r>
+    </w:p>
+    <w:p>
+      <w:pPr>
+        <w:jc w:val="center"/>
+        <w:rPr>
+          <w:i/>
+          <w:sz w:val="18"/>
+        </w:rPr>
+      </w:pPr>
+      <w:r>
+        <w:rPr>
+          <w:i/>
+          <w:sz w:val="18"/>
+        </w:rPr>
+        <w:t>Beispiel: Hinweis-Banner sowie Preisaenderung und entfernter Artikel in der Bestelluebersicht.</w:t>
       </w:r>
     </w:p>
     <w:p>

</xml_diff>

<commit_message>
Anleitung: Neues Kapitel 4.1 "Bestellliste aus Backup wiederherstellen"
Neue Sektion unter Kapitel 4 (Warenkorb) mit zwei Screenshots (zugeklappter
und aufgeklappter Zustand), Elementtabelle für den aufgeklappten Bereich
(Datei-Upload, Textfeld, Übernehmen-Button, Hinweistext) sowie einem
Anwendungsfälle-Abschnitt: Backup einspielen, Übertragung auf ein neues
Gerät (Geräte kennen sich nicht, da alles nur lokal gespeichert wird), und
Weitergabe von Artikelvorschlägen an andere Mitglieder per Signal/WhatsApp
oder CSV-Datei. Inhaltsverzeichnis um den neuen Punkt ergänzt, Stand-Datum
aktualisiert.

Co-Authored-By: Claude Sonnet 5 <noreply@anthropic.com>
Claude-Session: https://claude.ai/code/session_01Cv8pt3jB9jwN7WHjt8S9jj
</commit_message>
<xml_diff>
--- a/FoodCoop-Alte-Eiche-Webshop-Anleitung.docx
+++ b/FoodCoop-Alte-Eiche-Webshop-Anleitung.docx
@@ -42,7 +42,7 @@
         <w:rPr>
           <w:color w:val="646464"/>
         </w:rPr>
-        <w:t>Stand: 29. August 2026</w:t>
+        <w:t>Stand: 2. September 2026</w:t>
       </w:r>
     </w:p>
     <w:p>
@@ -593,6 +593,64 @@
           <w:noProof/>
         </w:rPr>
         <w:instrText xml:space="preserve"> PAGEREF _Toc238900576 \h </w:instrText>
+      </w:r>
+      <w:r>
+        <w:rPr>
+          <w:noProof/>
+        </w:rPr>
+      </w:r>
+      <w:r>
+        <w:rPr>
+          <w:noProof/>
+        </w:rPr>
+        <w:fldChar w:fldCharType="separate"/>
+      </w:r>
+      <w:r>
+        <w:rPr>
+          <w:noProof/>
+        </w:rPr>
+        <w:t>10</w:t>
+      </w:r>
+      <w:r>
+        <w:rPr>
+          <w:noProof/>
+        </w:rPr>
+        <w:fldChar w:fldCharType="end"/>
+      </w:r>
+    </w:p>
+    <w:p>
+      <w:pPr>
+        <w:pStyle w:val="Verzeichnis2"/>
+        <w:tabs>
+          <w:tab w:val="right" w:leader="dot" w:pos="9062"/>
+        </w:tabs>
+        <w:rPr>
+          <w:noProof/>
+        </w:rPr>
+      </w:pPr>
+      <w:r>
+        <w:rPr>
+          <w:noProof/>
+        </w:rPr>
+        <w:t>4.1 Bestellliste aus Backup wiederherstellen</w:t>
+      </w:r>
+      <w:r>
+        <w:rPr>
+          <w:noProof/>
+        </w:rPr>
+        <w:tab/>
+      </w:r>
+      <w:r>
+        <w:rPr>
+          <w:noProof/>
+        </w:rPr>
+        <w:fldChar w:fldCharType="begin"/>
+      </w:r>
+      <w:r>
+        <w:rPr>
+          <w:noProof/>
+        </w:rPr>
+        <w:instrText xml:space="preserve"> PAGEREF _Toc900000001 \h </w:instrText>
       </w:r>
       <w:r>
         <w:rPr>
@@ -4426,6 +4484,452 @@
         </w:tc>
       </w:tr>
     </w:tbl>
+    <w:p/>
+    <w:p>
+      <w:pPr>
+        <w:pStyle w:val="berschrift2"/>
+      </w:pPr>
+      <w:bookmarkStart w:id="900" w:name="_Toc900000001"/>
+      <w:r>
+        <w:t>4.1 Bestellliste aus Backup wiederherstellen</w:t>
+      </w:r>
+      <w:bookmarkEnd w:id="900"/>
+    </w:p>
+    <w:p>
+      <w:r>
+        <w:t>Im aufklappbaren Bereich unterhalb der Warenkorb-Buttons laesst sich eine zuvor heruntergeladene Bestellliste (CSV) oder eine einfache Liste von Artikelnummern wieder in den Warenkorb laden. Ergaenzt den Warenkorb, ersetzt ihn nie -- ein bewusstes Ersetzen erreicht man selbst ueber "Leeren" und anschliessenden Import. Preise kommen dabei immer aktuell aus dem Katalog, unabhaengig davon, was im Backup stand.</w:t>
+      </w:r>
+    </w:p>
+    <w:p>
+      <w:pPr>
+        <w:jc w:val="center"/>
+      </w:pPr>
+      <w:r>
+        <w:rPr>
+          <w:noProof/>
+        </w:rPr>
+        <w:drawing>
+          <wp:inline distT="0" distB="0" distL="0" distR="0">
+            <wp:extent cx="2800000" cy="2787330"/>
+            <wp:effectExtent l="0" t="0" r="0" b="0"/>
+            <wp:docPr id="900" name="Grafik 900"/>
+            <wp:cNvGraphicFramePr/>
+            <a:graphic xmlns:a="http://schemas.openxmlformats.org/drawingml/2006/main">
+              <a:graphicData uri="http://schemas.openxmlformats.org/drawingml/2006/picture">
+                <pic:pic xmlns:pic="http://schemas.openxmlformats.org/drawingml/2006/picture">
+                  <pic:nvPicPr>
+                    <pic:cNvPr id="900" name=""/>
+                    <pic:cNvPicPr/>
+                  </pic:nvPicPr>
+                  <pic:blipFill>
+                    <a:blip r:embed="rId25"/>
+                    <a:stretch>
+                      <a:fillRect/>
+                    </a:stretch>
+                  </pic:blipFill>
+                  <pic:spPr>
+                    <a:xfrm>
+                      <a:off x="0" y="0"/>
+                      <a:ext cx="2800000" cy="2787330"/>
+                    </a:xfrm>
+                    <a:prstGeom prst="rect">
+                      <a:avLst/>
+                    </a:prstGeom>
+                  </pic:spPr>
+                </pic:pic>
+              </a:graphicData>
+            </a:graphic>
+          </wp:inline>
+        </w:drawing>
+      </w:r>
+    </w:p>
+    <w:p>
+      <w:pPr>
+        <w:jc w:val="center"/>
+        <w:rPr>
+          <w:i/>
+          <w:sz w:val="18"/>
+        </w:rPr>
+      </w:pPr>
+      <w:r>
+        <w:rPr>
+          <w:i/>
+          <w:sz w:val="18"/>
+        </w:rPr>
+        <w:t>Zugeklappt: Zum Oeffnen auf die Zeile "Bestellliste aus Backup wiederherstellen" tippen/klicken.</w:t>
+      </w:r>
+    </w:p>
+    <w:p>
+      <w:pPr>
+        <w:jc w:val="center"/>
+      </w:pPr>
+      <w:r>
+        <w:rPr>
+          <w:noProof/>
+        </w:rPr>
+        <w:drawing>
+          <wp:inline distT="0" distB="0" distL="0" distR="0">
+            <wp:extent cx="2800000" cy="4624434"/>
+            <wp:effectExtent l="0" t="0" r="0" b="0"/>
+            <wp:docPr id="901" name="Grafik 901"/>
+            <wp:cNvGraphicFramePr/>
+            <a:graphic xmlns:a="http://schemas.openxmlformats.org/drawingml/2006/main">
+              <a:graphicData uri="http://schemas.openxmlformats.org/drawingml/2006/picture">
+                <pic:pic xmlns:pic="http://schemas.openxmlformats.org/drawingml/2006/picture">
+                  <pic:nvPicPr>
+                    <pic:cNvPr id="901" name=""/>
+                    <pic:cNvPicPr/>
+                  </pic:nvPicPr>
+                  <pic:blipFill>
+                    <a:blip r:embed="rId26"/>
+                    <a:stretch>
+                      <a:fillRect/>
+                    </a:stretch>
+                  </pic:blipFill>
+                  <pic:spPr>
+                    <a:xfrm>
+                      <a:off x="0" y="0"/>
+                      <a:ext cx="2800000" cy="4624434"/>
+                    </a:xfrm>
+                    <a:prstGeom prst="rect">
+                      <a:avLst/>
+                    </a:prstGeom>
+                  </pic:spPr>
+                </pic:pic>
+              </a:graphicData>
+            </a:graphic>
+          </wp:inline>
+        </w:drawing>
+      </w:r>
+    </w:p>
+    <w:p>
+      <w:pPr>
+        <w:jc w:val="center"/>
+        <w:rPr>
+          <w:i/>
+          <w:sz w:val="18"/>
+        </w:rPr>
+      </w:pPr>
+      <w:r>
+        <w:rPr>
+          <w:i/>
+          <w:sz w:val="18"/>
+        </w:rPr>
+        <w:t>Aufgeklappter Zustand mit Datei-Upload und Textfeld.</w:t>
+      </w:r>
+    </w:p>
+    <w:tbl>
+      <w:tblPr>
+        <w:tblW w:w="9080" w:type="dxa"/>
+        <w:tblBorders>
+          <w:top w:val="single" w:sz="4" w:space="0" w:color="auto"/>
+          <w:left w:val="single" w:sz="4" w:space="0" w:color="auto"/>
+          <w:bottom w:val="single" w:sz="4" w:space="0" w:color="auto"/>
+          <w:right w:val="single" w:sz="4" w:space="0" w:color="auto"/>
+          <w:insideH w:val="single" w:sz="4" w:space="0" w:color="auto"/>
+          <w:insideV w:val="single" w:sz="4" w:space="0" w:color="auto"/>
+        </w:tblBorders>
+        <w:tblLayout w:type="fixed"/>
+        <w:tblCellMar>
+          <w:left w:w="70" w:type="dxa"/>
+          <w:right w:w="70" w:type="dxa"/>
+        </w:tblCellMar>
+        <w:tblLook w:val="0000" w:firstRow="0" w:lastRow="0" w:firstColumn="0" w:lastColumn="0" w:noHBand="0" w:noVBand="0"/>
+      </w:tblPr>
+      <w:tblGrid>
+        <w:gridCol w:w="680"/>
+        <w:gridCol w:w="8400"/>
+      </w:tblGrid>
+      <w:tr>
+        <w:tc>
+          <w:tcPr>
+            <w:tcW w:w="680" w:type="dxa"/>
+            <w:shd w:val="clear" w:color="auto" w:fill="2C5B39"/>
+          </w:tcPr>
+          <w:p>
+            <w:pPr>
+              <w:rPr>
+                <w:b/>
+                <w:color w:val="FFFFFF"/>
+                <w:sz w:val="20"/>
+              </w:rPr>
+            </w:pPr>
+            <w:r>
+              <w:rPr>
+                <w:b/>
+                <w:color w:val="FFFFFF"/>
+                <w:sz w:val="20"/>
+              </w:rPr>
+              <w:t>Nr.</w:t>
+            </w:r>
+          </w:p>
+        </w:tc>
+        <w:tc>
+          <w:tcPr>
+            <w:tcW w:w="8400" w:type="dxa"/>
+            <w:shd w:val="clear" w:color="auto" w:fill="2C5B39"/>
+          </w:tcPr>
+          <w:p>
+            <w:pPr>
+              <w:rPr>
+                <w:b/>
+                <w:color w:val="FFFFFF"/>
+                <w:sz w:val="20"/>
+              </w:rPr>
+            </w:pPr>
+            <w:r>
+              <w:rPr>
+                <w:b/>
+                <w:color w:val="FFFFFF"/>
+                <w:sz w:val="20"/>
+              </w:rPr>
+              <w:t>Element</w:t>
+            </w:r>
+          </w:p>
+        </w:tc>
+      </w:tr>
+      <w:tr>
+        <w:tc>
+          <w:tcPr>
+            <w:tcW w:w="680" w:type="dxa"/>
+            <w:shd w:val="clear" w:color="auto" w:fill="auto"/>
+          </w:tcPr>
+          <w:p>
+            <w:pPr>
+              <w:rPr>
+                <w:sz w:val="20"/>
+              </w:rPr>
+            </w:pPr>
+            <w:r>
+              <w:rPr>
+                <w:sz w:val="20"/>
+              </w:rPr>
+              <w:t>1</w:t>
+            </w:r>
+          </w:p>
+        </w:tc>
+        <w:tc>
+          <w:tcPr>
+            <w:tcW w:w="8400" w:type="dxa"/>
+            <w:shd w:val="clear" w:color="auto" w:fill="auto"/>
+          </w:tcPr>
+          <w:p>
+            <w:pPr>
+              <w:rPr>
+                <w:sz w:val="20"/>
+              </w:rPr>
+            </w:pPr>
+            <w:r>
+              <w:rPr>
+                <w:sz w:val="20"/>
+              </w:rPr>
+              <w:t>Aufklappbare Ueberschrift "Bestellliste aus Backup wiederherstellen" - oeffnet/schliesst diesen Bereich.</w:t>
+            </w:r>
+          </w:p>
+        </w:tc>
+      </w:tr>
+      <w:tr>
+        <w:tc>
+          <w:tcPr>
+            <w:tcW w:w="680" w:type="dxa"/>
+            <w:shd w:val="clear" w:color="auto" w:fill="auto"/>
+          </w:tcPr>
+          <w:p>
+            <w:pPr>
+              <w:rPr>
+                <w:sz w:val="20"/>
+              </w:rPr>
+            </w:pPr>
+            <w:r>
+              <w:rPr>
+                <w:sz w:val="20"/>
+              </w:rPr>
+              <w:t>2</w:t>
+            </w:r>
+          </w:p>
+        </w:tc>
+        <w:tc>
+          <w:tcPr>
+            <w:tcW w:w="8400" w:type="dxa"/>
+            <w:shd w:val="clear" w:color="auto" w:fill="auto"/>
+          </w:tcPr>
+          <w:p>
+            <w:pPr>
+              <w:rPr>
+                <w:sz w:val="20"/>
+              </w:rPr>
+            </w:pPr>
+            <w:r>
+              <w:rPr>
+                <w:sz w:val="20"/>
+              </w:rPr>
+              <w:t>Button "Datei hochladen (CSV)" - oeffnet die Dateiauswahl des Geraets; akzeptiert die selbst exportierte Bestellliste-CSV.</w:t>
+            </w:r>
+          </w:p>
+        </w:tc>
+      </w:tr>
+      <w:tr>
+        <w:tc>
+          <w:tcPr>
+            <w:tcW w:w="680" w:type="dxa"/>
+            <w:shd w:val="clear" w:color="auto" w:fill="auto"/>
+          </w:tcPr>
+          <w:p>
+            <w:pPr>
+              <w:rPr>
+                <w:sz w:val="20"/>
+              </w:rPr>
+            </w:pPr>
+            <w:r>
+              <w:rPr>
+                <w:sz w:val="20"/>
+              </w:rPr>
+              <w:t>3</w:t>
+            </w:r>
+          </w:p>
+        </w:tc>
+        <w:tc>
+          <w:tcPr>
+            <w:tcW w:w="8400" w:type="dxa"/>
+            <w:shd w:val="clear" w:color="auto" w:fill="auto"/>
+          </w:tcPr>
+          <w:p>
+            <w:pPr>
+              <w:rPr>
+                <w:sz w:val="20"/>
+              </w:rPr>
+            </w:pPr>
+            <w:r>
+              <w:rPr>
+                <w:sz w:val="20"/>
+              </w:rPr>
+              <w:t>Textfeld fuer Artikelnummern - Alternative zur Datei: eine kommagetrennte Liste von Artikelnummern einfuegen.</w:t>
+            </w:r>
+          </w:p>
+        </w:tc>
+      </w:tr>
+      <w:tr>
+        <w:tc>
+          <w:tcPr>
+            <w:tcW w:w="680" w:type="dxa"/>
+            <w:shd w:val="clear" w:color="auto" w:fill="auto"/>
+          </w:tcPr>
+          <w:p>
+            <w:pPr>
+              <w:rPr>
+                <w:sz w:val="20"/>
+              </w:rPr>
+            </w:pPr>
+            <w:r>
+              <w:rPr>
+                <w:sz w:val="20"/>
+              </w:rPr>
+              <w:t>4</w:t>
+            </w:r>
+          </w:p>
+        </w:tc>
+        <w:tc>
+          <w:tcPr>
+            <w:tcW w:w="8400" w:type="dxa"/>
+            <w:shd w:val="clear" w:color="auto" w:fill="auto"/>
+          </w:tcPr>
+          <w:p>
+            <w:pPr>
+              <w:rPr>
+                <w:sz w:val="20"/>
+              </w:rPr>
+            </w:pPr>
+            <w:r>
+              <w:rPr>
+                <w:sz w:val="20"/>
+              </w:rPr>
+              <w:t>Button "Uebernehmen" - uebernimmt die im Textfeld eingefuegten Artikelnummern.</w:t>
+            </w:r>
+          </w:p>
+        </w:tc>
+      </w:tr>
+      <w:tr>
+        <w:tc>
+          <w:tcPr>
+            <w:tcW w:w="680" w:type="dxa"/>
+            <w:shd w:val="clear" w:color="auto" w:fill="auto"/>
+          </w:tcPr>
+          <w:p>
+            <w:pPr>
+              <w:rPr>
+                <w:sz w:val="20"/>
+              </w:rPr>
+            </w:pPr>
+            <w:r>
+              <w:rPr>
+                <w:sz w:val="20"/>
+              </w:rPr>
+              <w:t>5</w:t>
+            </w:r>
+          </w:p>
+        </w:tc>
+        <w:tc>
+          <w:tcPr>
+            <w:tcW w:w="8400" w:type="dxa"/>
+            <w:shd w:val="clear" w:color="auto" w:fill="auto"/>
+          </w:tcPr>
+          <w:p>
+            <w:pPr>
+              <w:rPr>
+                <w:sz w:val="20"/>
+              </w:rPr>
+            </w:pPr>
+            <w:r>
+              <w:rPr>
+                <w:sz w:val="20"/>
+              </w:rPr>
+              <w:t>Hinweistext - erklaert, dass ergaenzt statt ersetzt wird und Preise immer aktuell aus dem Katalog kommen.</w:t>
+            </w:r>
+          </w:p>
+        </w:tc>
+      </w:tr>
+    </w:tbl>
+    <w:p>
+      <w:r>
+        <w:rPr>
+          <w:b/>
+        </w:rPr>
+        <w:t>Anwendungsfaelle:</w:t>
+      </w:r>
+    </w:p>
+    <w:p>
+      <w:r>
+        <w:rPr>
+          <w:b/>
+        </w:rPr>
+        <w:t>Backup einspielen:</w:t>
+      </w:r>
+      <w:r>
+        <w:t xml:space="preserve"> Eine zuvor heruntergeladene Bestellliste laesst sich jederzeit wieder in den Warenkorb laden, z. B. um eine fruehere Bestellung als Vorlage fuer eine neue zu nutzen.</w:t>
+      </w:r>
+    </w:p>
+    <w:p>
+      <w:r>
+        <w:rPr>
+          <w:b/>
+        </w:rPr>
+        <w:t>Neues Geraet:</w:t>
+      </w:r>
+      <w:r>
+        <w:t xml:space="preserve"> Warenkorb und Kundenkonto werden nur lokal auf einem Geraet gespeichert -- die Geraete kennen sich nicht. Eine gespeicherte Bestellliste-CSV laesst sich so auf ein neues Handy oder einen neuen Rechner uebertragen (Datei z. B. per E-Mail an sich selbst schicken, dann dort hochladen).</w:t>
+      </w:r>
+    </w:p>
+    <w:p>
+      <w:r>
+        <w:rPr>
+          <w:b/>
+        </w:rPr>
+        <w:t>Weitergabe an andere Mitglieder:</w:t>
+      </w:r>
+      <w:r>
+        <w:t xml:space="preserve"> Um einem anderen Mitglied dieselben Artikel vorzuschlagen, reicht es, entweder die Bestellliste-CSV weiterzugeben oder einfach die Artikelnummern zu teilen, z. B. per Signal- oder WhatsApp-Nachricht -- die Empfaengerin fuegt sie dann direkt ins Textfeld ein.</w:t>
+      </w:r>
+    </w:p>
     <w:p/>
     <w:p>
       <w:pPr>

</xml_diff>

<commit_message>
Anleitung: ASCII-Umlaute (ae/oe/ue) und falsches ss statt ß korrigiert
Rund 190 Stellen im Fließtext, in Überschriften, Tabellen und dem
Inhaltsverzeichnis, in denen Umlaute als ae/oe/ue geschrieben waren
(z. B. "fuer", "Ueberschrift", "Geraet"), wurden auf ä/ö/ü korrigiert.
Zusätzlich wurde ss durch ß ersetzt, wo die korrekte Rechtschreibung es
verlangt (z. B. "ausschliesslich" -> "ausschließlich", "Begruessungstext"
-> "Begrüßungstext"). Korrekt geschriebene ss-Wörter (z. B. "dass",
"muss", "Passwort", "Adresse") und Wörter mit zufälligem "ae/ue"-Anteil
ohne Umlautbezug (z. B. "aktuell", "neu", "manuell", "Datenquelle")
blieben unverändert.

Co-Authored-By: Claude Sonnet 5 <noreply@anthropic.com>
Claude-Session: https://claude.ai/code/session_01Cv8pt3jB9jwN7WHjt8S9jj
</commit_message>
<xml_diff>
--- a/FoodCoop-Alte-Eiche-Webshop-Anleitung.docx
+++ b/FoodCoop-Alte-Eiche-Webshop-Anleitung.docx
@@ -29,7 +29,7 @@
           <w:color w:val="2C5B39"/>
           <w:sz w:val="32"/>
         </w:rPr>
-        <w:t>Webshop - Bedienungsanleitung und Seitenuebersicht</w:t>
+        <w:t>Webshop - Bedienungsanleitung und Seitenübersicht</w:t>
       </w:r>
     </w:p>
     <w:p>
@@ -154,7 +154,7 @@
         <w:rPr>
           <w:noProof/>
         </w:rPr>
-        <w:t>1. Ueberblick</w:t>
+        <w:t>1. Überblick</w:t>
       </w:r>
       <w:r>
         <w:rPr>
@@ -692,7 +692,7 @@
         <w:rPr>
           <w:noProof/>
         </w:rPr>
-        <w:t>5. Bestelluebersicht</w:t>
+        <w:t>5. Bestellübersicht</w:t>
       </w:r>
       <w:r>
         <w:rPr>
@@ -1052,7 +1052,7 @@
         <w:rPr>
           <w:noProof/>
         </w:rPr>
-        <w:t>6.5 Prozentzuschlaege</w:t>
+        <w:t>6.5 Prozentzuschläge</w:t>
       </w:r>
       <w:r>
         <w:rPr>
@@ -1172,7 +1172,7 @@
         <w:rPr>
           <w:noProof/>
         </w:rPr>
-        <w:t>6.7 Admin-Passwort aendern</w:t>
+        <w:t>6.7 Admin-Passwort ändern</w:t>
       </w:r>
       <w:r>
         <w:rPr>
@@ -1232,7 +1232,7 @@
         <w:rPr>
           <w:noProof/>
         </w:rPr>
-        <w:t>7. Ablauf einer Bestellung - Schritt fuer Schritt</w:t>
+        <w:t>7. Ablauf einer Bestellung - Schritt für Schritt</w:t>
       </w:r>
       <w:r>
         <w:rPr>
@@ -1412,7 +1412,7 @@
         <w:rPr>
           <w:noProof/>
         </w:rPr>
-        <w:t>Schritt 3: Warenkorb pruefen</w:t>
+        <w:t>Schritt 3: Warenkorb prüfen</w:t>
       </w:r>
       <w:r>
         <w:rPr>
@@ -1472,7 +1472,7 @@
         <w:rPr>
           <w:noProof/>
         </w:rPr>
-        <w:t>Schritt 4: Zur Bestelluebersicht wechseln und Daten eingeben</w:t>
+        <w:t>Schritt 4: Zur Bestellübersicht wechseln und Daten eingeben</w:t>
       </w:r>
       <w:r>
         <w:rPr>
@@ -1532,7 +1532,7 @@
         <w:rPr>
           <w:noProof/>
         </w:rPr>
-        <w:t>Schritt 5: Bestellung abschliessen</w:t>
+        <w:t>Schritt 5: Bestellung abschließen</w:t>
       </w:r>
       <w:r>
         <w:rPr>
@@ -1593,18 +1593,18 @@
       <w:bookmarkStart w:id="1" w:name="_Toc238900569"/>
       <w:r>
         <w:lastRenderedPageBreak/>
-        <w:t>1. Ueberblick</w:t>
+        <w:t>1. Überblick</w:t>
       </w:r>
       <w:bookmarkEnd w:id="1"/>
     </w:p>
     <w:p>
       <w:r>
-        <w:t>Der Webshop der FoodCoop Alte Eiche laeuft vollstaendig im Browser, ohne eigene Datenbank und ohne Server-Backend. Der Produktkatalog und die Zuschlaege werden beim Aufruf der Seite aus CSV-Dateien des Hostings geladen, damit alle Mitglieder denselben Stand sehen. Kundenkonten, der Warenkorb und das Admin-Passwort werden dagegen lokal im Browser des jeweiligen Geraets gespeichert.</w:t>
-      </w:r>
-    </w:p>
-    <w:p>
-      <w:r>
-        <w:t>Dieses Dokument beschreibt in Kapitel 2 bis 6 jede Seite des Shops mit einem Screenshot, auf dem die wichtigsten Bedienelemente durchnummeriert sind, sowie einer Tabelle mit der Erklaerung zu jeder Nummer. Kapitel 7 beschreibt den kompletten Ablauf einer Bestellung von der Artikelsuche bis zum Versand der Bestellung.</w:t>
+        <w:t>Der Webshop der FoodCoop Alte Eiche läuft vollständig im Browser, ohne eigene Datenbank und ohne Server-Backend. Der Produktkatalog und die Zuschläge werden beim Aufruf der Seite aus CSV-Dateien des Hostings geladen, damit alle Mitglieder denselben Stand sehen. Kundenkonten, der Warenkorb und das Admin-Passwort werden dagegen lokal im Browser des jeweiligen Geräts gespeichert.</w:t>
+      </w:r>
+    </w:p>
+    <w:p>
+      <w:r>
+        <w:t>Dieses Dokument beschreibt in Kapitel 2 bis 6 jede Seite des Shops mit einem Screenshot, auf dem die wichtigsten Bedienelemente durchnummeriert sind, sowie einer Tabelle mit der Erklärung zu jeder Nummer. Kapitel 7 beschreibt den kompletten Ablauf einer Bestellung von der Artikelsuche bis zum Versand der Bestellung.</w:t>
       </w:r>
     </w:p>
     <w:p>
@@ -1619,7 +1619,7 @@
     </w:p>
     <w:p>
       <w:r>
-        <w:t>Beim ersten Aufruf des Shops erscheint die Anmeldeseite. Neue Mitglieder registrieren sich selbst; bestehende Mitglieder melden sich mit Benutzername/E-Mail und Passwort an. Passwoerter werden gesalzen gehasht gespeichert, nie im Klartext.</w:t>
+        <w:t>Beim ersten Aufruf des Shops erscheint die Anmeldeseite. Neue Mitglieder registrieren sich selbst; bestehende Mitglieder melden sich mit Benutzername/E-Mail und Passwort an. Passwörter werden gesalzen gehasht gespeichert, nie im Klartext.</w:t>
       </w:r>
     </w:p>
     <w:p>
@@ -1946,7 +1946,7 @@
               <w:rPr>
                 <w:sz w:val="20"/>
               </w:rPr>
-              <w:t>Eingabefeld fuer Benutzername oder E-Mail-Adresse.</w:t>
+              <w:t>Eingabefeld für Benutzername oder E-Mail-Adresse.</w:t>
             </w:r>
           </w:p>
         </w:tc>
@@ -1987,7 +1987,7 @@
               <w:rPr>
                 <w:sz w:val="20"/>
               </w:rPr>
-              <w:t>Eingabefeld fuer das Passwort.</w:t>
+              <w:t>Eingabefeld für das Passwort.</w:t>
             </w:r>
           </w:p>
         </w:tc>
@@ -2027,7 +2027,7 @@
               <w:rPr>
                 <w:sz w:val="20"/>
               </w:rPr>
-              <w:t>Button "Anmelden" - meldet an, wenn Benutzername/E-Mail und Passwort uebereinstimmen.</w:t>
+              <w:t>Button "Anmelden" - meldet an, wenn Benutzername/E-Mail und Passwort übereinstimmen.</w:t>
             </w:r>
           </w:p>
         </w:tc>
@@ -2067,7 +2067,7 @@
               <w:rPr>
                 <w:sz w:val="20"/>
               </w:rPr>
-              <w:t>Link "Passwort vergessen?" - oeffnet die Passwort-Zuruecksetzen-Ansicht (siehe 2.3).</w:t>
+              <w:t>Link "Passwort vergessen?" - öffnet die Passwort-Zurücksetzen-Ansicht (siehe 2.3).</w:t>
             </w:r>
           </w:p>
         </w:tc>
@@ -2443,7 +2443,7 @@
               <w:rPr>
                 <w:sz w:val="20"/>
               </w:rPr>
-              <w:t>Eingabefeld IBAN (optional, fuer eventuelle Rueckueberweisungen).</w:t>
+              <w:t>Eingabefeld IBAN (optional, für eventuelle Rücküberweisungen).</w:t>
             </w:r>
           </w:p>
         </w:tc>
@@ -2523,7 +2523,7 @@
               <w:rPr>
                 <w:sz w:val="20"/>
               </w:rPr>
-              <w:t>Eingabefeld Passwort wiederholen - muss mit dem Passwort uebereinstimmen.</w:t>
+              <w:t>Eingabefeld Passwort wiederholen - muss mit dem Passwort übereinstimmen.</w:t>
             </w:r>
           </w:p>
         </w:tc>
@@ -2582,7 +2582,7 @@
     </w:p>
     <w:p>
       <w:r>
-        <w:t>Da Kundenkonten nur lokal im jeweiligen Browser gespeichert werden, kann ein vergessenes Passwort nicht von der Verwaltung zurueckgesetzt werden. Stattdessen bestaetigt sich das Mitglied selbst ueber Benutzername und die bei der Registrierung hinterlegte E-Mail-Adresse und vergibt direkt ein neues Passwort.</w:t>
+        <w:t>Da Kundenkonten nur lokal im jeweiligen Browser gespeichert werden, kann ein vergessenes Passwort nicht von der Verwaltung zurückgesetzt werden. Stattdessen bestätigt sich das Mitglied selbst über Benutzername und die bei der Registrierung hinterlegte E-Mail-Adresse und vergibt direkt ein neues Passwort.</w:t>
       </w:r>
     </w:p>
     <w:p>
@@ -2820,7 +2820,7 @@
               <w:rPr>
                 <w:sz w:val="20"/>
               </w:rPr>
-              <w:t>Eingabefeld fuer das neue Passwort.</w:t>
+              <w:t>Eingabefeld für das neue Passwort.</w:t>
             </w:r>
           </w:p>
         </w:tc>
@@ -2900,7 +2900,7 @@
               <w:rPr>
                 <w:sz w:val="20"/>
               </w:rPr>
-              <w:t>Button "Passwort setzen" - aendert das Passwort und meldet direkt an.</w:t>
+              <w:t>Button "Passwort setzen" - ändert das Passwort und meldet direkt an.</w:t>
             </w:r>
           </w:p>
         </w:tc>
@@ -2940,7 +2940,7 @@
               <w:rPr>
                 <w:sz w:val="20"/>
               </w:rPr>
-              <w:t>Link "Zurueck zum Login" - bricht ab und kehrt zur Anmeldung zurueck.</w:t>
+              <w:t>Link "Zurück zum Login" - bricht ab und kehrt zur Anmeldung zurück.</w:t>
             </w:r>
           </w:p>
         </w:tc>
@@ -2959,7 +2959,7 @@
     </w:p>
     <w:p>
       <w:r>
-        <w:t>Unter "Mein Konto" in der Kopfzeile koennen angemeldete Mitglieder die bei der Registrierung hinterlegten Angaben (Vorname, Nachname, E-Mail-Adresse und IBAN) jederzeit einsehen und aendern. Diese Daten werden automatisch in die Bestellliste und die Bestell-E-Mail uebernommen (siehe Kapitel 5).</w:t>
+        <w:t>Unter "Mein Konto" in der Kopfzeile können angemeldete Mitglieder die bei der Registrierung hinterlegten Angaben (Vorname, Nachname, E-Mail-Adresse und IBAN) jederzeit einsehen und ändern. Diese Daten werden automatisch in die Bestellliste und die Bestell-E-Mail übernommen (siehe Kapitel 5).</w:t>
       </w:r>
     </w:p>
     <w:p>
@@ -3158,7 +3158,7 @@
               <w:rPr>
                 <w:sz w:val="20"/>
               </w:rPr>
-              <w:t>Button "Zurueck zum Shop" - kehrt zur Produktliste zurueck.</w:t>
+              <w:t>Button "Zurück zum Shop" - kehrt zur Produktliste zurück.</w:t>
             </w:r>
           </w:p>
         </w:tc>
@@ -3319,7 +3319,7 @@
               <w:rPr>
                 <w:sz w:val="20"/>
               </w:rPr>
-              <w:t>Eingabefeld IBAN (fuer Rueckueberweisungen, optional).</w:t>
+              <w:t>Eingabefeld IBAN (für Rücküberweisungen, optional).</w:t>
             </w:r>
           </w:p>
         </w:tc>
@@ -3359,7 +3359,7 @@
               <w:rPr>
                 <w:sz w:val="20"/>
               </w:rPr>
-              <w:t>Button "Aenderungen speichern" - speichert die geaenderten Angaben sofort.</w:t>
+              <w:t>Button "Änderungen speichern" - speichert die geänderten Angaben sofort.</w:t>
             </w:r>
           </w:p>
         </w:tc>
@@ -3378,7 +3378,7 @@
     </w:p>
     <w:p>
       <w:r>
-        <w:t>Nach der Anmeldung erscheint die Shop-Hauptseite mit dem gesamten Produktkatalog. Der Hintergrund zeigt eine bunte Marktstand-Illustration; Suchleiste, Ergebnisanzeige und Produktkarten liegen als halbtransparente, gut lesbare Flaechen darueber.</w:t>
+        <w:t>Nach der Anmeldung erscheint die Shop-Hauptseite mit dem gesamten Produktkatalog. Der Hintergrund zeigt eine bunte Marktstand-Illustration; Suchleiste, Ergebnisanzeige und Produktkarten liegen als halbtransparente, gut lesbare Flächen darüber.</w:t>
       </w:r>
     </w:p>
     <w:p>
@@ -3535,7 +3535,7 @@
               <w:rPr>
                 <w:sz w:val="20"/>
               </w:rPr>
-              <w:t>Logo und Titel - Klick fuehrt zur Shop-Hauptseite zurueck.</w:t>
+              <w:t>Logo und Titel - Klick führt zur Shop-Hauptseite zurück.</w:t>
             </w:r>
           </w:p>
         </w:tc>
@@ -3615,7 +3615,7 @@
               <w:rPr>
                 <w:sz w:val="20"/>
               </w:rPr>
-              <w:t>Navigationspunkt "Daten verwalten" - oeffnet den Admin-Bereich (siehe Kapitel 6).</w:t>
+              <w:t>Navigationspunkt "Daten verwalten" - öffnet den Admin-Bereich (siehe Kapitel 6).</w:t>
             </w:r>
           </w:p>
         </w:tc>
@@ -3735,7 +3735,7 @@
               <w:rPr>
                 <w:sz w:val="20"/>
               </w:rPr>
-              <w:t>Warenkorb-Symbol mit der Anzahl der Artikel im Warenkorb - oeffnet den Warenkorb (siehe Kapitel 4).</w:t>
+              <w:t>Warenkorb-Symbol mit der Anzahl der Artikel im Warenkorb - öffnet den Warenkorb (siehe Kapitel 4).</w:t>
             </w:r>
           </w:p>
         </w:tc>
@@ -3775,7 +3775,7 @@
               <w:rPr>
                 <w:sz w:val="20"/>
               </w:rPr>
-              <w:t>Willkommensbereich mit Begruessungstext.</w:t>
+              <w:t>Willkommensbereich mit Begrüßungstext.</w:t>
             </w:r>
           </w:p>
         </w:tc>
@@ -3856,7 +3856,7 @@
               <w:rPr>
                 <w:sz w:val="20"/>
               </w:rPr>
-              <w:t>Auswahl der Kategorie (Trockenware, Drogerie/Kosmetik/Nonfood, Getraenke, Feinkost/Veganer Ersatz).</w:t>
+              <w:t>Auswahl der Kategorie (Trockenware, Drogerie/Kosmetik/Nonfood, Getränke, Feinkost/Veganer Ersatz).</w:t>
             </w:r>
           </w:p>
         </w:tc>
@@ -3936,7 +3936,7 @@
               <w:rPr>
                 <w:sz w:val="20"/>
               </w:rPr>
-              <w:t>Anzahl der gefundenen Artikel fuer die aktuelle Suche/Filterung.</w:t>
+              <w:t>Anzahl der gefundenen Artikel für die aktuelle Suche/Filterung.</w:t>
             </w:r>
           </w:p>
         </w:tc>
@@ -4016,7 +4016,7 @@
               <w:rPr>
                 <w:sz w:val="20"/>
               </w:rPr>
-              <w:t>Seitennavigation zum Blaettern durch die Suchergebnisse.</w:t>
+              <w:t>Seitennavigation zum Blättern durch die Suchergebnisse.</w:t>
             </w:r>
           </w:p>
         </w:tc>
@@ -4025,7 +4025,7 @@
     <w:p/>
     <w:p>
       <w:r>
-        <w:t>Die "Preisdetails" jeder Produktkarte zeigen ausschliesslich den Gesamtpreis sowie den enthaltenen MwSt.-Anteil (7% oder 19%, artikelabhaengig). Der interne Zuschlag der Einkaufsgemeinschaft ist fuer Kunden nirgends einzeln sichtbar.</w:t>
+        <w:t>Die "Preisdetails" jeder Produktkarte zeigen ausschließlich den Gesamtpreis sowie den enthaltenen MwSt.-Anteil (7% oder 19%, artikelabhängig). Der interne Zuschlag der Einkaufsgemeinschaft ist für Kunden nirgends einzeln sichtbar.</w:t>
       </w:r>
     </w:p>
     <w:p>
@@ -4040,7 +4040,7 @@
     </w:p>
     <w:p>
       <w:r>
-        <w:t>Der Warenkorb oeffnet sich als Seitenleiste von rechts, ohne die Shop-Ansicht zu verlassen.</w:t>
+        <w:t>Der Warenkorb öffnet sich als Seitenleiste von rechts, ohne die Shop-Ansicht zu verlassen.</w:t>
       </w:r>
     </w:p>
     <w:p>
@@ -4197,7 +4197,7 @@
               <w:rPr>
                 <w:sz w:val="20"/>
               </w:rPr>
-              <w:t>Ueberschrift "Warenkorb".</w:t>
+              <w:t>Überschrift "Warenkorb".</w:t>
             </w:r>
           </w:p>
         </w:tc>
@@ -4237,7 +4237,7 @@
               <w:rPr>
                 <w:sz w:val="20"/>
               </w:rPr>
-              <w:t>Schliessen-Button - schliesst die Seitenleiste, ohne den Inhalt zu veraendern.</w:t>
+              <w:t>Schließen-Button - schließt die Seitenleiste, ohne den Inhalt zu verändern.</w:t>
             </w:r>
           </w:p>
         </w:tc>
@@ -4317,7 +4317,7 @@
               <w:rPr>
                 <w:sz w:val="20"/>
               </w:rPr>
-              <w:t>Mengensteuerung (-/Anzahl/+) fuer diesen Artikel.</w:t>
+              <w:t>Mengensteuerung (-/Anzahl/+) für diesen Artikel.</w:t>
             </w:r>
           </w:p>
         </w:tc>
@@ -4478,7 +4478,7 @@
               <w:rPr>
                 <w:sz w:val="20"/>
               </w:rPr>
-              <w:t>Button "Zur Bestelluebersicht" - wechselt zur Bestelluebersicht (siehe Kapitel 5).</w:t>
+              <w:t>Button "Zur Bestellübersicht" - wechselt zur Bestellübersicht (siehe Kapitel 5).</w:t>
             </w:r>
           </w:p>
         </w:tc>
@@ -4497,7 +4497,7 @@
     </w:p>
     <w:p>
       <w:r>
-        <w:t>Im aufklappbaren Bereich unterhalb der Warenkorb-Buttons laesst sich eine zuvor heruntergeladene Bestellliste (CSV) oder eine einfache Liste von Artikelnummern wieder in den Warenkorb laden. Ergaenzt den Warenkorb, ersetzt ihn nie -- ein bewusstes Ersetzen erreicht man selbst ueber "Leeren" und anschliessenden Import. Preise kommen dabei immer aktuell aus dem Katalog, unabhaengig davon, was im Backup stand.</w:t>
+        <w:t>Im aufklappbaren Bereich unterhalb der Warenkorb-Buttons lässt sich eine zuvor heruntergeladene Bestellliste (CSV) oder eine einfache Liste von Artikelnummern wieder in den Warenkorb laden. Ergänzt den Warenkorb, ersetzt ihn nie -- ein bewusstes Ersetzen erreicht man selbst über "Leeren" und anschließenden Import. Preise kommen dabei immer aktuell aus dem Katalog, unabhängig davon, was im Backup stand.</w:t>
       </w:r>
     </w:p>
     <w:p>
@@ -4556,7 +4556,7 @@
           <w:i/>
           <w:sz w:val="18"/>
         </w:rPr>
-        <w:t>Zugeklappt: Zum Oeffnen auf die Zeile "Bestellliste aus Backup wiederherstellen" tippen/klicken.</w:t>
+        <w:t>Zugeklappt: Zum Öffnen auf die Zeile "Bestellliste aus Backup wiederherstellen" tippen/klicken.</w:t>
       </w:r>
     </w:p>
     <w:p>
@@ -4723,7 +4723,7 @@
               <w:rPr>
                 <w:sz w:val="20"/>
               </w:rPr>
-              <w:t>Aufklappbare Ueberschrift "Bestellliste aus Backup wiederherstellen" - oeffnet/schliesst diesen Bereich.</w:t>
+              <w:t>Aufklappbare Überschrift "Bestellliste aus Backup wiederherstellen" - öffnet/schließt diesen Bereich.</w:t>
             </w:r>
           </w:p>
         </w:tc>
@@ -4763,7 +4763,7 @@
               <w:rPr>
                 <w:sz w:val="20"/>
               </w:rPr>
-              <w:t>Button "Datei hochladen (CSV)" - oeffnet die Dateiauswahl des Geraets; akzeptiert die selbst exportierte Bestellliste-CSV.</w:t>
+              <w:t>Button "Datei hochladen (CSV)" - öffnet die Dateiauswahl des Geräts; akzeptiert die selbst exportierte Bestellliste-CSV.</w:t>
             </w:r>
           </w:p>
         </w:tc>
@@ -4803,7 +4803,7 @@
               <w:rPr>
                 <w:sz w:val="20"/>
               </w:rPr>
-              <w:t>Textfeld fuer Artikelnummern - Alternative zur Datei: eine kommagetrennte Liste von Artikelnummern einfuegen.</w:t>
+              <w:t>Textfeld für Artikelnummern - Alternative zur Datei: eine kommagetrennte Liste von Artikelnummern einfügen.</w:t>
             </w:r>
           </w:p>
         </w:tc>
@@ -4843,7 +4843,7 @@
               <w:rPr>
                 <w:sz w:val="20"/>
               </w:rPr>
-              <w:t>Button "Uebernehmen" - uebernimmt die im Textfeld eingefuegten Artikelnummern.</w:t>
+              <w:t>Button "Übernehmen" - übernimmt die im Textfeld eingefügten Artikelnummern.</w:t>
             </w:r>
           </w:p>
         </w:tc>
@@ -4883,7 +4883,7 @@
               <w:rPr>
                 <w:sz w:val="20"/>
               </w:rPr>
-              <w:t>Hinweistext - erklaert, dass ergaenzt statt ersetzt wird und Preise immer aktuell aus dem Katalog kommen.</w:t>
+              <w:t>Hinweistext - erklärt, dass ergänzt statt ersetzt wird und Preise immer aktuell aus dem Katalog kommen.</w:t>
             </w:r>
           </w:p>
         </w:tc>
@@ -4894,7 +4894,7 @@
         <w:rPr>
           <w:b/>
         </w:rPr>
-        <w:t>Anwendungsfaelle:</w:t>
+        <w:t>Anwendungsfälle:</w:t>
       </w:r>
     </w:p>
     <w:p>
@@ -4905,7 +4905,7 @@
         <w:t>Backup einspielen:</w:t>
       </w:r>
       <w:r>
-        <w:t xml:space="preserve"> Eine zuvor heruntergeladene Bestellliste laesst sich jederzeit wieder in den Warenkorb laden, z. B. um eine fruehere Bestellung als Vorlage fuer eine neue zu nutzen.</w:t>
+        <w:t xml:space="preserve"> Eine zuvor heruntergeladene Bestellliste lässt sich jederzeit wieder in den Warenkorb laden, z. B. um eine frühere Bestellung als Vorlage für eine neue zu nutzen.</w:t>
       </w:r>
     </w:p>
     <w:p>
@@ -4913,10 +4913,10 @@
         <w:rPr>
           <w:b/>
         </w:rPr>
-        <w:t>Neues Geraet:</w:t>
-      </w:r>
-      <w:r>
-        <w:t xml:space="preserve"> Warenkorb und Kundenkonto werden nur lokal auf einem Geraet gespeichert -- die Geraete kennen sich nicht. Eine gespeicherte Bestellliste-CSV laesst sich so auf ein neues Handy oder einen neuen Rechner uebertragen (Datei z. B. per E-Mail an sich selbst schicken, dann dort hochladen).</w:t>
+        <w:t>Neues Gerät:</w:t>
+      </w:r>
+      <w:r>
+        <w:t xml:space="preserve"> Warenkorb und Kundenkonto werden nur lokal auf einem Gerät gespeichert -- die Geräte kennen sich nicht. Eine gespeicherte Bestellliste-CSV lässt sich so auf ein neues Handy oder einen neuen Rechner übertragen (Datei z. B. per E-Mail an sich selbst schicken, dann dort hochladen).</w:t>
       </w:r>
     </w:p>
     <w:p>
@@ -4927,7 +4927,7 @@
         <w:t>Weitergabe an andere Mitglieder:</w:t>
       </w:r>
       <w:r>
-        <w:t xml:space="preserve"> Um einem anderen Mitglied dieselben Artikel vorzuschlagen, reicht es, entweder die Bestellliste-CSV weiterzugeben oder einfach die Artikelnummern zu teilen, z. B. per Signal- oder WhatsApp-Nachricht -- die Empfaengerin fuegt sie dann direkt ins Textfeld ein.</w:t>
+        <w:t xml:space="preserve"> Um einem anderen Mitglied dieselben Artikel vorzuschlagen, reicht es, entweder die Bestellliste-CSV weiterzugeben oder einfach die Artikelnummern zu teilen, z. B. per Signal- oder WhatsApp-Nachricht -- die Empfängerin fügt sie dann direkt ins Textfeld ein.</w:t>
       </w:r>
     </w:p>
     <w:p/>
@@ -4937,13 +4937,13 @@
       </w:pPr>
       <w:bookmarkStart w:id="9" w:name="_Toc238900577"/>
       <w:r>
-        <w:t>5. Bestelluebersicht</w:t>
+        <w:t>5. Bestellübersicht</w:t>
       </w:r>
       <w:bookmarkEnd w:id="9"/>
     </w:p>
     <w:p>
       <w:r>
-        <w:t>Die Bestelluebersicht fasst alle Positionen zusammen und dient als letzter Schritt vor dem Versand der Bestellung.</w:t>
+        <w:t>Die Bestellübersicht fasst alle Positionen zusammen und dient als letzter Schritt vor dem Versand der Bestellung.</w:t>
       </w:r>
     </w:p>
     <w:p>
@@ -5100,7 +5100,7 @@
               <w:rPr>
                 <w:sz w:val="20"/>
               </w:rPr>
-              <w:t>Ueberschrift "Bestelluebersicht".</w:t>
+              <w:t>Überschrift "Bestellübersicht".</w:t>
             </w:r>
           </w:p>
         </w:tc>
@@ -5140,7 +5140,7 @@
               <w:rPr>
                 <w:sz w:val="20"/>
               </w:rPr>
-              <w:t>Button "Zurueck zum Shop" - kehrt zur Produktliste zurueck.</w:t>
+              <w:t>Button "Zurück zum Shop" - kehrt zur Produktliste zurück.</w:t>
             </w:r>
           </w:p>
         </w:tc>
@@ -5260,7 +5260,7 @@
               <w:rPr>
                 <w:sz w:val="20"/>
               </w:rPr>
-              <w:t>Eingabefeld Eigene Bankverbindung (fuer eine eventuelle Rueckueberweisung).</w:t>
+              <w:t>Eingabefeld Eigene Bankverbindung (für eine eventuelle Rücküberweisung).</w:t>
             </w:r>
           </w:p>
         </w:tc>
@@ -5300,7 +5300,7 @@
               <w:rPr>
                 <w:sz w:val="20"/>
               </w:rPr>
-              <w:t>Bestelltabelle mit Artikelnummer, Bezeichnung, Gebinde, Preis, MwSt.-Satz, Menge und Summe je Position. Haben sich Preise seit der letzten Auswahl geaendert oder ist ein Artikel nicht mehr verfuegbar, wird das rot markiert (alter Preis durchgestrichen bzw. ganze Zeile durchgestrichen mit dem Hinweis "nicht mehr verfuegbar").</w:t>
+              <w:t>Bestelltabelle mit Artikelnummer, Bezeichnung, Gebinde, Preis, MwSt.-Satz, Menge und Summe je Position. Haben sich Preise seit der letzten Auswahl geändert oder ist ein Artikel nicht mehr verfügbar, wird das rot markiert (alter Preis durchgestrichen bzw. ganze Zeile durchgestrichen mit dem Hinweis "nicht mehr verfügbar").</w:t>
             </w:r>
           </w:p>
         </w:tc>
@@ -5380,7 +5380,7 @@
               <w:rPr>
                 <w:sz w:val="20"/>
               </w:rPr>
-              <w:t>Button "Drucken" - oeffnet den Druckdialog des Browsers.</w:t>
+              <w:t>Button "Drucken" - öffnet den Druckdialog des Browsers.</w:t>
             </w:r>
           </w:p>
         </w:tc>
@@ -5420,7 +5420,7 @@
               <w:rPr>
                 <w:sz w:val="20"/>
               </w:rPr>
-              <w:t xml:space="preserve">Button "Bestellliste als CSV herunterladen" - laedt eine Datei mit den im Konto hinterlegten Angaben (Vorname, Nachname, E-Mail, IBAN - siehe Kapitel 2.4), den hier eingegebenen Angaben (Name, </w:t>
+              <w:t xml:space="preserve">Button "Bestellliste als CSV herunterladen" - lädt eine Datei mit den im Konto hinterlegten Angaben (Vorname, Nachname, E-Mail, IBAN - siehe Kapitel 2.4), den hier eingegebenen Angaben (Name, </w:t>
             </w:r>
             <w:r>
               <w:rPr>
@@ -5468,7 +5468,7 @@
               <w:rPr>
                 <w:sz w:val="20"/>
               </w:rPr>
-              <w:t>Button "Bestellung per E-Mail senden" - oeffnet das E-Mail-Programm mit einer vorausgefuellten Nachricht an alteeiche.info@gmail.com.</w:t>
+              <w:t>Button "Bestellung per E-Mail senden" - öffnet das E-Mail-Programm mit einer vorausgefüllten Nachricht an alteeiche.info@gmail.com.</w:t>
             </w:r>
           </w:p>
         </w:tc>
@@ -5477,12 +5477,12 @@
     <w:p/>
     <w:p>
       <w:r>
-        <w:t>Name, Adresse und Bankverbindung werden lokal gespeichert und beim naechsten Besuch automatisch wieder vorausgefuellt. Vorname, Nachname, E-Mail und IBAN stammen automatisch aus dem angemeldeten Konto (siehe Kapitel 2.4 Mein Konto).</w:t>
-      </w:r>
-    </w:p>
-    <w:p>
-      <w:r>
-        <w:t>Beim Aufruf der Bestelluebersicht wird der Produktkatalog automatisch neu vom Server geladen und mit dem zuvor angezeigten Stand verglichen. Das ist wichtig, wenn ein Warenkorb laenger im Browser liegen bleibt (z. B. ueber mehrere Besuche hinweg) und sich in der Zwischenzeit Preise oder das Sortiment geaendert haben. Dabei werden zwei Faelle unterschieden:</w:t>
+        <w:t>Name, Adresse und Bankverbindung werden lokal gespeichert und beim nächsten Besuch automatisch wieder vorausgefüllt. Vorname, Nachname, E-Mail und IBAN stammen automatisch aus dem angemeldeten Konto (siehe Kapitel 2.4 Mein Konto).</w:t>
+      </w:r>
+    </w:p>
+    <w:p>
+      <w:r>
+        <w:t>Beim Aufruf der Bestellübersicht wird der Produktkatalog automatisch neu vom Server geladen und mit dem zuvor angezeigten Stand verglichen. Das ist wichtig, wenn ein Warenkorb länger im Browser liegen bleibt (z. B. über mehrere Besuche hinweg) und sich in der Zwischenzeit Preise oder das Sortiment geändert haben. Dabei werden zwei Fälle unterschieden:</w:t>
       </w:r>
     </w:p>
     <w:tbl>
@@ -5570,7 +5570,7 @@
               <w:rPr>
                 <w:sz w:val="20"/>
               </w:rPr>
-              <w:t>Preis eines Artikels hat sich geaendert</w:t>
+              <w:t>Preis eines Artikels hat sich geändert</w:t>
             </w:r>
           </w:p>
         </w:tc>
@@ -5626,7 +5626,7 @@
               <w:rPr>
                 <w:sz w:val="20"/>
               </w:rPr>
-              <w:t>Die komplette Zeile wird durchgestrichen und rot dargestellt, statt einer Summe erscheint der Hinweis "nicht mehr verfuegbar".</w:t>
+              <w:t>Die komplette Zeile wird durchgestrichen und rot dargestellt, statt einer Summe erscheint der Hinweis "nicht mehr verfügbar".</w:t>
             </w:r>
           </w:p>
         </w:tc>
@@ -5634,7 +5634,7 @@
     </w:tbl>
     <w:p>
       <w:r>
-        <w:t>In beiden Faellen erscheint zusaetzlich oben in der Bestelluebersicht ein rot umrandeter Hinweis-Banner, der auf die Anzahl betroffener Positionen aufmerksam macht. Das folgende Beispiel zeigt beide Faelle gleichzeitig: eine Preisaenderung (zweite Zeile) sowie einen entfernten Artikel (letzte Zeile).</w:t>
+        <w:t>In beiden Fällen erscheint zusätzlich oben in der Bestellübersicht ein rot umrandeter Hinweis-Banner, der auf die Anzahl betroffener Positionen aufmerksam macht. Das folgende Beispiel zeigt beide Fälle gleichzeitig: eine Preisänderung (zweite Zeile) sowie einen entfernten Artikel (letzte Zeile).</w:t>
       </w:r>
     </w:p>
     <w:p>
@@ -5693,7 +5693,7 @@
           <w:i/>
           <w:sz w:val="18"/>
         </w:rPr>
-        <w:t>Beispiel: Hinweis-Banner sowie Preisaenderung und entfernter Artikel in der Bestelluebersicht.</w:t>
+        <w:t>Beispiel: Hinweis-Banner sowie Preisänderung und entfernter Artikel in der Bestellübersicht.</w:t>
       </w:r>
     </w:p>
     <w:p>
@@ -5709,7 +5709,7 @@
     </w:p>
     <w:p>
       <w:r>
-        <w:t>Der Verwaltungsbereich ist ueber "Daten verwalten" in der Kopfzeile erreichbar und zusaetzlich durch ein eigenes Admin-Passwort geschuetzt, das unabhaengig von den Kundenkonten ist.</w:t>
+        <w:t>Der Verwaltungsbereich ist über "Daten verwalten" in der Kopfzeile erreichbar und zusätzlich durch ein eigenes Admin-Passwort geschützt, das unabhängig von den Kundenkonten ist.</w:t>
       </w:r>
     </w:p>
     <w:p>
@@ -5881,7 +5881,7 @@
               <w:rPr>
                 <w:sz w:val="20"/>
               </w:rPr>
-              <w:t>Ueberschrift "Admin-Passwort einrichten".</w:t>
+              <w:t>Überschrift "Admin-Passwort einrichten".</w:t>
             </w:r>
           </w:p>
         </w:tc>
@@ -6020,7 +6020,7 @@
     </w:p>
     <w:p>
       <w:r>
-        <w:t>Ist bereits ein Admin-Passwort vergeben, muss es bei jedem neuen Besuch erneut eingegeben werden (die Entsperrung gilt nur fuer die aktuelle Browser-Sitzung).</w:t>
+        <w:t>Ist bereits ein Admin-Passwort vergeben, muss es bei jedem neuen Besuch erneut eingegeben werden (die Entsperrung gilt nur für die aktuelle Browser-Sitzung).</w:t>
       </w:r>
     </w:p>
     <w:p>
@@ -6178,7 +6178,7 @@
               <w:rPr>
                 <w:sz w:val="20"/>
               </w:rPr>
-              <w:t>Ueberschrift "Verwaltungsbereich gesperrt".</w:t>
+              <w:t>Überschrift "Verwaltungsbereich gesperrt".</w:t>
             </w:r>
           </w:p>
         </w:tc>
@@ -6510,7 +6510,7 @@
               <w:rPr>
                 <w:sz w:val="20"/>
               </w:rPr>
-              <w:t>Anzahl der Kundenkonten, die auf diesem Geraet registriert wurden.</w:t>
+              <w:t>Anzahl der Kundenkonten, die auf diesem Gerät registriert wurden.</w:t>
             </w:r>
           </w:p>
         </w:tc>
@@ -6609,7 +6609,7 @@
     </w:p>
     <w:p>
       <w:r>
-        <w:t>Fuer jede der 5 Kategorien gibt es eine eigene Zeile. Ein Upload zeigt zunaechst nur eine lokale Vorschau im eigenen Browser; erst der Export der Datei und das Ersetzen im Hosting macht die Aenderung fuer alle Mitglieder sichtbar.</w:t>
+        <w:t>Für jede der 5 Kategorien gibt es eine eigene Zeile. Ein Upload zeigt zunächst nur eine lokale Vorschau im eigenen Browser; erst der Export der Datei und das Ersetzen im Hosting macht die Änderung für alle Mitglieder sichtbar.</w:t>
       </w:r>
     </w:p>
     <w:p>
@@ -6847,7 +6847,7 @@
               <w:rPr>
                 <w:sz w:val="20"/>
               </w:rPr>
-              <w:t>Pfad der zugehoerigen Server-Datei (data/*.csv).</w:t>
+              <w:t>Pfad der zugehörigen Server-Datei (data/*.csv).</w:t>
             </w:r>
           </w:p>
         </w:tc>
@@ -6887,7 +6887,7 @@
               <w:rPr>
                 <w:sz w:val="20"/>
               </w:rPr>
-              <w:t>Button "Hochladen (Vorschau)" - laedt eine CSV-Datei hoch und ersetzt die Kategorie lokal.</w:t>
+              <w:t>Button "Hochladen (Vorschau)" - lädt eine CSV-Datei hoch und ersetzt die Kategorie lokal.</w:t>
             </w:r>
           </w:p>
         </w:tc>
@@ -6927,7 +6927,7 @@
               <w:rPr>
                 <w:sz w:val="20"/>
               </w:rPr>
-              <w:t>Button "Exportieren" - laedt die aktuellen Daten der Kategorie als CSV herunter.</w:t>
+              <w:t>Button "Exportieren" - lädt die aktuellen Daten der Kategorie als CSV herunter.</w:t>
             </w:r>
           </w:p>
         </w:tc>
@@ -6967,7 +6967,7 @@
               <w:rPr>
                 <w:sz w:val="20"/>
               </w:rPr>
-              <w:t>Button "Alle Kategorien vom Server neu laden" - verwirft lokale Vorschauen und laedt den veroeffentlichten Stand.</w:t>
+              <w:t>Button "Alle Kategorien vom Server neu laden" - verwirft lokale Vorschauen und lädt den veröffentlichten Stand.</w:t>
             </w:r>
           </w:p>
         </w:tc>
@@ -6980,13 +6980,13 @@
       </w:pPr>
       <w:bookmarkStart w:id="15" w:name="_Toc238900583"/>
       <w:r>
-        <w:t>6.5 Prozentzuschlaege</w:t>
+        <w:t>6.5 Prozentzuschläge</w:t>
       </w:r>
       <w:bookmarkEnd w:id="15"/>
     </w:p>
     <w:p>
       <w:r>
-        <w:t>Der Zuschlag der Einkaufsgemeinschaft (Ruecklage, Bankkosten, Fahrtkosten usw.) wird auf den Bodan-Preis inklusive MwSt. aufgeschlagen und ergibt den Verkaufspreis. Fuer Kunden ist er nie einzeln sichtbar.</w:t>
+        <w:t>Der Zuschlag der Einkaufsgemeinschaft (Rücklage, Bankkosten, Fahrtkosten usw.) wird auf den Bodan-Preis inklusive MwSt. aufgeschlagen und ergibt den Verkaufspreis. Für Kunden ist er nie einzeln sichtbar.</w:t>
       </w:r>
     </w:p>
     <w:p>
@@ -7144,7 +7144,7 @@
               <w:rPr>
                 <w:sz w:val="20"/>
               </w:rPr>
-              <w:t>Datenquelle der Zuschlaege (Server, lokale Vorschau oder Standarddaten).</w:t>
+              <w:t>Datenquelle der Zuschläge (Server, lokale Vorschau oder Standarddaten).</w:t>
             </w:r>
           </w:p>
         </w:tc>
@@ -7264,7 +7264,7 @@
               <w:rPr>
                 <w:sz w:val="20"/>
               </w:rPr>
-              <w:t>Entfernen-Button fuer diesen Posten.</w:t>
+              <w:t>Entfernen-Button für diesen Posten.</w:t>
             </w:r>
           </w:p>
         </w:tc>
@@ -7304,7 +7304,7 @@
               <w:rPr>
                 <w:sz w:val="20"/>
               </w:rPr>
-              <w:t>Button "+ Zuschlag hinzufuegen" - legt einen neuen, leeren Posten an.</w:t>
+              <w:t>Button "+ Zuschlag hinzufügen" - legt einen neuen, leeren Posten an.</w:t>
             </w:r>
           </w:p>
         </w:tc>
@@ -7384,7 +7384,7 @@
               <w:rPr>
                 <w:sz w:val="20"/>
               </w:rPr>
-              <w:t>Manuelles Eingabefeld, um den Gesamt-Zuschlag ohne Aenderung der Einzelposten zu ueberschreiben.</w:t>
+              <w:t>Manuelles Eingabefeld, um den Gesamt-Zuschlag ohne Änderung der Einzelposten zu überschreiben.</w:t>
             </w:r>
           </w:p>
         </w:tc>
@@ -7424,7 +7424,7 @@
               <w:rPr>
                 <w:sz w:val="20"/>
               </w:rPr>
-              <w:t>Button "Zuruecksetzen" - loescht die manuelle Ueberschreibung wieder.</w:t>
+              <w:t>Button "Zurücksetzen" - löscht die manuelle Überschreibung wieder.</w:t>
             </w:r>
           </w:p>
         </w:tc>
@@ -7464,7 +7464,7 @@
               <w:rPr>
                 <w:sz w:val="20"/>
               </w:rPr>
-              <w:t>Button zum Hochladen einer Zuschlaege-CSV (ersetzt alle Felder).</w:t>
+              <w:t>Button zum Hochladen einer Zuschläge-CSV (ersetzt alle Felder).</w:t>
             </w:r>
           </w:p>
         </w:tc>
@@ -7504,7 +7504,7 @@
               <w:rPr>
                 <w:sz w:val="20"/>
               </w:rPr>
-              <w:t>Button "Zuschlaege als CSV exportieren".</w:t>
+              <w:t>Button "Zuschläge als CSV exportieren".</w:t>
             </w:r>
           </w:p>
         </w:tc>
@@ -7523,7 +7523,7 @@
     </w:p>
     <w:p>
       <w:r>
-        <w:t>Da Kundenkonten nur lokal gespeichert werden, zeigt dieser Bereich ausschliesslich die auf diesem Geraet registrierten Konten.</w:t>
+        <w:t>Da Kundenkonten nur lokal gespeichert werden, zeigt dieser Bereich ausschließlich die auf diesem Gerät registrierten Konten.</w:t>
       </w:r>
     </w:p>
     <w:p>
@@ -7681,7 +7681,7 @@
               <w:rPr>
                 <w:sz w:val="20"/>
               </w:rPr>
-              <w:t>Button "Kundenkonten als CSV exportieren" (Spalten: Benutzername, E-Mail, Salt, Hash, Erstellt - Passwoerter nie im Klartext).</w:t>
+              <w:t>Button "Kundenkonten als CSV exportieren" (Spalten: Benutzername, E-Mail, Salt, Hash, Erstellt - Passwörter nie im Klartext).</w:t>
             </w:r>
           </w:p>
         </w:tc>
@@ -7721,7 +7721,7 @@
               <w:rPr>
                 <w:sz w:val="20"/>
               </w:rPr>
-              <w:t>Button zum Hochladen einer Kundenkonten-CSV (ersetzt alle Konten auf diesem Geraet).</w:t>
+              <w:t>Button zum Hochladen einer Kundenkonten-CSV (ersetzt alle Konten auf diesem Gerät).</w:t>
             </w:r>
           </w:p>
         </w:tc>
@@ -7734,7 +7734,7 @@
       </w:pPr>
       <w:bookmarkStart w:id="17" w:name="_Toc238900585"/>
       <w:r>
-        <w:t>6.7 Admin-Passwort aendern</w:t>
+        <w:t>6.7 Admin-Passwort ändern</w:t>
       </w:r>
       <w:bookmarkEnd w:id="17"/>
     </w:p>
@@ -8012,7 +8012,7 @@
               <w:rPr>
                 <w:sz w:val="20"/>
               </w:rPr>
-              <w:t>Button "Passwort aendern".</w:t>
+              <w:t>Button "Passwort ändern".</w:t>
             </w:r>
           </w:p>
         </w:tc>
@@ -8021,7 +8021,7 @@
     <w:p/>
     <w:p>
       <w:r>
-        <w:t>Im Anschluss an diesen Bereich befindet sich zusaetzlich der Button "Auf Original-Bodan-Daten zuruecksetzen", der Produktkatalog und Zuschlaege auf die eingebetteten Ausgangsdaten zuruecksetzt (Kundenkonten bleiben dabei erhalten).</w:t>
+        <w:t>Im Anschluss an diesen Bereich befindet sich zusätzlich der Button "Auf Original-Bodan-Daten zurücksetzen", der Produktkatalog und Zuschläge auf die eingebetteten Ausgangsdaten zurücksetzt (Kundenkonten bleiben dabei erhalten).</w:t>
       </w:r>
     </w:p>
     <w:p>
@@ -8036,7 +8036,7 @@
       <w:bookmarkStart w:id="18" w:name="_Toc238900586"/>
       <w:r>
         <w:lastRenderedPageBreak/>
-        <w:t>7. Ablauf einer Bestellung - Schritt fuer Schritt</w:t>
+        <w:t>7. Ablauf einer Bestellung - Schritt für Schritt</w:t>
       </w:r>
       <w:bookmarkEnd w:id="18"/>
     </w:p>
@@ -8057,7 +8057,7 @@
     </w:p>
     <w:p>
       <w:r>
-        <w:t>Nach der Anmeldung sucht das Mitglied im Suchfeld nach einem gewuenschten Artikel, hier zum Beispiel "Schokomilch". Die Trefferliste zeigt sofort den passenden Artikel mit Preis, Gebinde und Grundpreis je Einheit.</w:t>
+        <w:t>Nach der Anmeldung sucht das Mitglied im Suchfeld nach einem gewünschten Artikel, hier zum Beispiel "Schokomilch". Die Trefferliste zeigt sofort den passenden Artikel mit Preis, Gebinde und Grundpreis je Einheit.</w:t>
       </w:r>
     </w:p>
     <w:p>
@@ -8121,7 +8121,7 @@
     </w:p>
     <w:p>
       <w:r>
-        <w:t>Ueber die "+"-Schaltflaeche oder direkte Eingabe der Anzahl wird die gewuenschte Menge festgelegt (hier: 3 Gebinde). Die Anzahl wird sofort im Warenkorb-Symbol oben rechts sichtbar.</w:t>
+        <w:t>Über die "+"-Schaltfläche oder direkte Eingabe der Anzahl wird die gewünschte Menge festgelegt (hier: 3 Gebinde). Die Anzahl wird sofort im Warenkorb-Symbol oben rechts sichtbar.</w:t>
       </w:r>
     </w:p>
     <w:p>
@@ -8180,13 +8180,13 @@
       </w:pPr>
       <w:bookmarkStart w:id="21" w:name="_Toc238900589"/>
       <w:r>
-        <w:t>Schritt 3: Warenkorb pruefen</w:t>
+        <w:t>Schritt 3: Warenkorb prüfen</w:t>
       </w:r>
       <w:bookmarkEnd w:id="21"/>
     </w:p>
     <w:p>
       <w:r>
-        <w:t>Ein Klick auf das Warenkorb-Symbol oeffnet die Seitenleiste mit allen bisher hinzugefuegten Artikeln. Mengen lassen sich hier direkt anpassen oder Artikel entfernen. Die Gesamtsumme wird laufend aktualisiert.</w:t>
+        <w:t>Ein Klick auf das Warenkorb-Symbol öffnet die Seitenleiste mit allen bisher hinzugefügten Artikeln. Mengen lassen sich hier direkt anpassen oder Artikel entfernen. Die Gesamtsumme wird laufend aktualisiert.</w:t>
       </w:r>
     </w:p>
     <w:p>
@@ -8244,13 +8244,13 @@
       </w:pPr>
       <w:bookmarkStart w:id="22" w:name="_Toc238900590"/>
       <w:r>
-        <w:t>Schritt 4: Zur Bestelluebersicht wechseln und Daten eingeben</w:t>
+        <w:t>Schritt 4: Zur Bestellübersicht wechseln und Daten eingeben</w:t>
       </w:r>
       <w:bookmarkEnd w:id="22"/>
     </w:p>
     <w:p>
       <w:r>
-        <w:t>Ueber 'Zur Bestelluebersicht' gelangt man zur finalen Ansicht. Hier werden Name, Adresse und die eigene Bankverbindung eingetragen (fuer eine moegliche Rueckueberweisung, z. B. bei Differenzen). Diese Angaben werden fuer kuenftige Bestellungen gespeichert.</w:t>
+        <w:t>Über 'Zur Bestellübersicht' gelangt man zur finalen Ansicht. Hier werden Name, Adresse und die eigene Bankverbindung eingetragen (für eine mögliche Rücküberweisung, z. B. bei Differenzen). Diese Angaben werden für künftige Bestellungen gespeichert.</w:t>
       </w:r>
     </w:p>
     <w:p>
@@ -8309,13 +8309,13 @@
       </w:pPr>
       <w:bookmarkStart w:id="23" w:name="_Toc238900591"/>
       <w:r>
-        <w:t>Schritt 5: Bestellung abschliessen</w:t>
+        <w:t>Schritt 5: Bestellung abschließen</w:t>
       </w:r>
       <w:bookmarkEnd w:id="23"/>
     </w:p>
     <w:p>
       <w:r>
-        <w:t>Von der Bestelluebersicht aus stehen drei Moeglichkeiten zur Verfuegung:</w:t>
+        <w:t>Von der Bestellübersicht aus stehen drei Möglichkeiten zur Verfügung:</w:t>
       </w:r>
     </w:p>
     <w:p>
@@ -8323,7 +8323,7 @@
         <w:pStyle w:val="KeinLeerraum"/>
       </w:pPr>
       <w:r>
-        <w:t>Drucken - oeffnet den Druckdialog des Browsers fuer eine Papierkopie.</w:t>
+        <w:t>Drucken - öffnet den Druckdialog des Browsers für eine Papierkopie.</w:t>
       </w:r>
     </w:p>
     <w:p>
@@ -8339,7 +8339,7 @@
         <w:pStyle w:val="KeinLeerraum"/>
       </w:pPr>
       <w:r>
-        <w:t>Bestellung per E-Mail senden - oeffnet das E-Mail-Programm mit einer vorausgefuellten Nachricht an alteeiche.info@gmail.com; die heruntergeladene CSV-Datei kann vor dem Absenden manuell angehaengt werden.</w:t>
+        <w:t>Bestellung per E-Mail senden - öffnet das E-Mail-Programm mit einer vorausgefüllten Nachricht an alteeiche.info@gmail.com; die heruntergeladene CSV-Datei kann vor dem Absenden manuell angehängt werden.</w:t>
       </w:r>
     </w:p>
     <w:p>
@@ -8358,7 +8358,7 @@
           <w:i/>
           <w:color w:val="646464"/>
         </w:rPr>
-        <w:t>Hinweis: Der in den Beispielen dieses Dokuments verwendete Warenkorb dient nur zur Veranschaulichung und enthaelt Beispieldaten.</w:t>
+        <w:t>Hinweis: Der in den Beispielen dieses Dokuments verwendete Warenkorb dient nur zur Veranschaulichung und enthält Beispieldaten.</w:t>
       </w:r>
     </w:p>
     <w:p>

</xml_diff>

<commit_message>
Anleitung: Positionsnummern auf Screenshots in Kapitel 4.1 ergänzt
Die beiden Screenshots (aufgeklappter und eingeklappter Zustand der
Bestellliste-Backup-Funktion) hatten im Gegensatz zu allen anderen
Kapiteln keine nummerierten roten Markierungen, die auf die Zeilen der
Nr./Element-Tabelle verweisen. Beide Bilder wurden neu erstellt (in
höherer Auflösung) und mit den passenden Positionsnummern 1-5 im
etablierten Stil (rotes Rund, weiße Zahl) versehen.

Co-Authored-By: Claude Sonnet 5 <noreply@anthropic.com>
Claude-Session: https://claude.ai/code/session_01Cv8pt3jB9jwN7WHjt8S9jj
</commit_message>
<xml_diff>
--- a/FoodCoop-Alte-Eiche-Webshop-Anleitung.docx
+++ b/FoodCoop-Alte-Eiche-Webshop-Anleitung.docx
@@ -4510,7 +4510,7 @@
         </w:rPr>
         <w:drawing>
           <wp:inline distT="0" distB="0" distL="0" distR="0">
-            <wp:extent cx="2800000" cy="2787330"/>
+            <wp:extent cx="2800000" cy="2739751"/>
             <wp:effectExtent l="0" t="0" r="0" b="0"/>
             <wp:docPr id="900" name="Grafik 900"/>
             <wp:cNvGraphicFramePr/>
@@ -4569,7 +4569,7 @@
         </w:rPr>
         <w:drawing>
           <wp:inline distT="0" distB="0" distL="0" distR="0">
-            <wp:extent cx="2800000" cy="4624434"/>
+            <wp:extent cx="2800000" cy="4420385"/>
             <wp:effectExtent l="0" t="0" r="0" b="0"/>
             <wp:docPr id="901" name="Grafik 901"/>
             <wp:cNvGraphicFramePr/>

</xml_diff>